<commit_message>
gracias profe Leidy por su valiosa amistad
</commit_message>
<xml_diff>
--- a/1_propuesta/prop_invest/articulo_pensamiento_computacional/1_administracion/estructura_presentacion.docx
+++ b/1_propuesta/prop_invest/articulo_pensamiento_computacional/1_administracion/estructura_presentacion.docx
@@ -183,6 +183,19 @@
         </w:rPr>
         <w:t>Learning</w:t>
       </w:r>
+      <w:r>
+        <w:rPr>
+          <w:rStyle w:val="FootnoteReference"/>
+          <w:rFonts w:ascii="Arial" w:hAnsi="Arial" w:eastAsia="Arial" w:cs="Arial"/>
+          <w:b w:val="0"/>
+          <w:bCs w:val="0"/>
+          <w:noProof w:val="0"/>
+          <w:sz w:val="24"/>
+          <w:szCs w:val="24"/>
+          <w:lang w:val="es-ES"/>
+        </w:rPr>
+        <w:footnoteReference w:id="18022"/>
+      </w:r>
     </w:p>
     <w:p>
       <w:pPr>
@@ -350,6 +363,7 @@
     <w:p>
       <w:pPr>
         <w:pStyle w:val="Normal"/>
+        <w:jc w:val="both"/>
         <w:rPr>
           <w:rFonts w:ascii="Arial" w:hAnsi="Arial" w:eastAsia="Arial" w:cs="Arial"/>
           <w:b w:val="1"/>
@@ -375,21 +389,318 @@
     </w:p>
     <w:p>
       <w:pPr>
-        <w:pStyle w:val="Normal"/>
-        <w:rPr>
-          <w:rFonts w:ascii="Arial" w:hAnsi="Arial" w:eastAsia="Arial" w:cs="Arial"/>
-          <w:b w:val="1"/>
-          <w:bCs w:val="1"/>
-          <w:noProof w:val="0"/>
-          <w:sz w:val="24"/>
-          <w:szCs w:val="24"/>
-          <w:lang w:val="es-ES"/>
-        </w:rPr>
-      </w:pPr>
-    </w:p>
-    <w:p>
-      <w:pPr>
-        <w:pStyle w:val="Normal"/>
+        <w:spacing w:before="360" w:beforeAutospacing="off" w:after="360" w:afterAutospacing="off"/>
+        <w:jc w:val="both"/>
+      </w:pPr>
+      <w:r>
+        <w:rPr>
+          <w:rFonts w:ascii="Arial" w:hAnsi="Arial" w:eastAsia="Arial" w:cs="Arial"/>
+          <w:b w:val="0"/>
+          <w:bCs w:val="0"/>
+          <w:i w:val="0"/>
+          <w:iCs w:val="0"/>
+          <w:caps w:val="0"/>
+          <w:smallCaps w:val="0"/>
+          <w:noProof w:val="0"/>
+          <w:color w:val="1F1F1F"/>
+          <w:sz w:val="24"/>
+          <w:szCs w:val="24"/>
+          <w:lang w:val="es-ES"/>
+        </w:rPr>
+        <w:t>El pensamiento computacional es una forma de pensar que permite a las personas resolver problemas de forma lógica y sistemática. Es una habilidad esencial en el mundo actual, ya que cada vez más tareas se automatizan y se requieren personas que puedan pensar críticamente y resolver problemas de forma creativa.</w:t>
+      </w:r>
+    </w:p>
+    <w:p>
+      <w:pPr>
+        <w:spacing w:before="360" w:beforeAutospacing="off" w:after="360" w:afterAutospacing="off"/>
+        <w:jc w:val="both"/>
+      </w:pPr>
+      <w:r>
+        <w:rPr>
+          <w:rFonts w:ascii="Arial" w:hAnsi="Arial" w:eastAsia="Arial" w:cs="Arial"/>
+          <w:b w:val="0"/>
+          <w:bCs w:val="0"/>
+          <w:i w:val="0"/>
+          <w:iCs w:val="0"/>
+          <w:caps w:val="0"/>
+          <w:smallCaps w:val="0"/>
+          <w:noProof w:val="0"/>
+          <w:color w:val="1F1F1F"/>
+          <w:sz w:val="24"/>
+          <w:szCs w:val="24"/>
+          <w:lang w:val="es-ES"/>
+        </w:rPr>
+        <w:t>El desarrollo del pensamiento computacional es especialmente importante para los estudiantes de Administración de Empresas. La administración de empresas es una disciplina que se ocupa de la gestión de los recursos de una empresa para lograr sus objetivos. Para ser un buen administrador, es necesario ser capaz de resolver problemas, tomar decisiones, gestionar el tiempo y trabajar en equipo. El pensamiento computacional puede ayudar a los estudiantes de administración de empresas a desarrollar estas habilidades.</w:t>
+      </w:r>
+    </w:p>
+    <w:p>
+      <w:pPr>
+        <w:spacing w:before="360" w:beforeAutospacing="off" w:after="360" w:afterAutospacing="off"/>
+        <w:jc w:val="both"/>
+      </w:pPr>
+      <w:r>
+        <w:rPr>
+          <w:rFonts w:ascii="Arial" w:hAnsi="Arial" w:eastAsia="Arial" w:cs="Arial"/>
+          <w:b w:val="0"/>
+          <w:bCs w:val="0"/>
+          <w:i w:val="0"/>
+          <w:iCs w:val="0"/>
+          <w:caps w:val="0"/>
+          <w:smallCaps w:val="0"/>
+          <w:noProof w:val="0"/>
+          <w:color w:val="1F1F1F"/>
+          <w:sz w:val="24"/>
+          <w:szCs w:val="24"/>
+          <w:lang w:val="es-ES"/>
+        </w:rPr>
+        <w:t>En este estudio, se investigará el impacto del desarrollo del pensamiento computacional en los estudiantes de administración de empresas. El estudio se llevará a cabo utilizando un programa de Python y Machine Learning. Los estudiantes aprenderán a utilizar Python para resolver problemas de administración de empresas. También aprenderán a utilizar Machine Learning para construir modelos que puedan predecir comportamientos futuros.</w:t>
+      </w:r>
+    </w:p>
+    <w:p>
+      <w:pPr>
+        <w:pStyle w:val="Normal"/>
+        <w:jc w:val="both"/>
+        <w:rPr>
+          <w:rFonts w:ascii="Arial" w:hAnsi="Arial" w:eastAsia="Arial" w:cs="Arial"/>
+          <w:b w:val="1"/>
+          <w:bCs w:val="1"/>
+          <w:noProof w:val="0"/>
+          <w:sz w:val="24"/>
+          <w:szCs w:val="24"/>
+          <w:lang w:val="es-ES"/>
+        </w:rPr>
+      </w:pPr>
+      <w:r>
+        <w:rPr>
+          <w:rFonts w:ascii="Arial" w:hAnsi="Arial" w:eastAsia="Arial" w:cs="Arial"/>
+          <w:b w:val="1"/>
+          <w:bCs w:val="1"/>
+          <w:noProof w:val="0"/>
+          <w:sz w:val="24"/>
+          <w:szCs w:val="24"/>
+          <w:lang w:val="es-ES"/>
+        </w:rPr>
+        <w:t>___</w:t>
+      </w:r>
+    </w:p>
+    <w:p>
+      <w:pPr>
+        <w:pStyle w:val="Normal"/>
+        <w:jc w:val="both"/>
+        <w:rPr>
+          <w:rFonts w:ascii="Arial" w:hAnsi="Arial" w:eastAsia="Arial" w:cs="Arial"/>
+          <w:b w:val="1"/>
+          <w:bCs w:val="1"/>
+          <w:noProof w:val="0"/>
+          <w:sz w:val="24"/>
+          <w:szCs w:val="24"/>
+          <w:lang w:val="es-ES"/>
+        </w:rPr>
+      </w:pPr>
+    </w:p>
+    <w:p>
+      <w:pPr>
+        <w:pStyle w:val="Normal"/>
+        <w:jc w:val="both"/>
+        <w:rPr>
+          <w:rFonts w:ascii="Arial" w:hAnsi="Arial" w:eastAsia="Arial" w:cs="Arial"/>
+          <w:b w:val="1"/>
+          <w:bCs w:val="1"/>
+          <w:noProof w:val="0"/>
+          <w:sz w:val="24"/>
+          <w:szCs w:val="24"/>
+          <w:lang w:val="es-ES"/>
+        </w:rPr>
+      </w:pPr>
+    </w:p>
+    <w:p>
+      <w:pPr>
+        <w:pStyle w:val="Normal"/>
+        <w:jc w:val="both"/>
+        <w:rPr>
+          <w:rFonts w:ascii="Arial" w:hAnsi="Arial" w:eastAsia="Arial" w:cs="Arial"/>
+          <w:b w:val="1"/>
+          <w:bCs w:val="1"/>
+          <w:noProof w:val="0"/>
+          <w:sz w:val="24"/>
+          <w:szCs w:val="24"/>
+          <w:lang w:val="es-ES"/>
+        </w:rPr>
+      </w:pPr>
+    </w:p>
+    <w:p>
+      <w:pPr>
+        <w:jc w:val="both"/>
+        <w:rPr>
+          <w:rFonts w:ascii="system-ui" w:hAnsi="system-ui" w:eastAsia="system-ui" w:cs="system-ui"/>
+          <w:b w:val="0"/>
+          <w:bCs w:val="0"/>
+          <w:i w:val="0"/>
+          <w:iCs w:val="0"/>
+          <w:caps w:val="0"/>
+          <w:smallCaps w:val="0"/>
+          <w:noProof w:val="0"/>
+          <w:color w:val="374151"/>
+          <w:sz w:val="24"/>
+          <w:szCs w:val="24"/>
+          <w:lang w:val="es-ES"/>
+        </w:rPr>
+      </w:pPr>
+      <w:r>
+        <w:rPr>
+          <w:rFonts w:ascii="system-ui" w:hAnsi="system-ui" w:eastAsia="system-ui" w:cs="system-ui"/>
+          <w:b w:val="0"/>
+          <w:bCs w:val="0"/>
+          <w:i w:val="0"/>
+          <w:iCs w:val="0"/>
+          <w:caps w:val="0"/>
+          <w:smallCaps w:val="0"/>
+          <w:noProof w:val="0"/>
+          <w:color w:val="374151"/>
+          <w:sz w:val="24"/>
+          <w:szCs w:val="24"/>
+          <w:lang w:val="es-ES"/>
+        </w:rPr>
+        <w:t>El pensamiento computacional es una habilidad fundamental en el mundo actual, ya que permite afrontar y resolver problemas de manera estructurada y lógica. En el contexto de la administración de empresas, el pensamiento computacional puede desempeñar un papel crucial para mejorar la toma de decisiones, analizar datos empresariales y optimizar procesos.</w:t>
+      </w:r>
+    </w:p>
+    <w:p>
+      <w:pPr>
+        <w:pStyle w:val="Normal"/>
+        <w:jc w:val="both"/>
+        <w:rPr>
+          <w:rFonts w:ascii="Arial" w:hAnsi="Arial" w:eastAsia="Arial" w:cs="Arial"/>
+          <w:b w:val="1"/>
+          <w:bCs w:val="1"/>
+          <w:noProof w:val="0"/>
+          <w:sz w:val="24"/>
+          <w:szCs w:val="24"/>
+          <w:lang w:val="es-ES"/>
+        </w:rPr>
+      </w:pPr>
+      <w:r>
+        <w:rPr>
+          <w:rFonts w:ascii="Arial" w:hAnsi="Arial" w:eastAsia="Arial" w:cs="Arial"/>
+          <w:b w:val="1"/>
+          <w:bCs w:val="1"/>
+          <w:noProof w:val="0"/>
+          <w:sz w:val="24"/>
+          <w:szCs w:val="24"/>
+          <w:lang w:val="es-ES"/>
+        </w:rPr>
+        <w:t>_____</w:t>
+      </w:r>
+    </w:p>
+    <w:p>
+      <w:pPr>
+        <w:pStyle w:val="Normal"/>
+        <w:jc w:val="both"/>
+        <w:rPr>
+          <w:rFonts w:ascii="Arial" w:hAnsi="Arial" w:eastAsia="Arial" w:cs="Arial"/>
+          <w:b w:val="1"/>
+          <w:bCs w:val="1"/>
+          <w:noProof w:val="0"/>
+          <w:sz w:val="24"/>
+          <w:szCs w:val="24"/>
+          <w:lang w:val="es-ES"/>
+        </w:rPr>
+      </w:pPr>
+    </w:p>
+    <w:p>
+      <w:pPr>
+        <w:pStyle w:val="Normal"/>
+        <w:jc w:val="both"/>
+        <w:rPr>
+          <w:rFonts w:ascii="Arial" w:hAnsi="Arial" w:eastAsia="Arial" w:cs="Arial"/>
+          <w:noProof w:val="0"/>
+          <w:sz w:val="24"/>
+          <w:szCs w:val="24"/>
+          <w:lang w:val="es-ES"/>
+        </w:rPr>
+      </w:pPr>
+      <w:hyperlink r:id="R36d38f3fb88e4a55">
+        <w:r>
+          <w:rPr>
+            <w:rStyle w:val="Hyperlink"/>
+            <w:rFonts w:ascii="Arial" w:hAnsi="Arial" w:eastAsia="Arial" w:cs="Arial"/>
+            <w:noProof w:val="0"/>
+            <w:sz w:val="24"/>
+            <w:szCs w:val="24"/>
+            <w:lang w:val="es-ES"/>
+          </w:rPr>
+          <w:t>Pensamiento computacional: qué es y cómo llevarlo al aula (unir.net)</w:t>
+        </w:r>
+      </w:hyperlink>
+    </w:p>
+    <w:p>
+      <w:pPr>
+        <w:pStyle w:val="Normal"/>
+        <w:jc w:val="both"/>
+        <w:rPr>
+          <w:rFonts w:ascii="Arial" w:hAnsi="Arial" w:eastAsia="Arial" w:cs="Arial"/>
+          <w:noProof w:val="0"/>
+          <w:sz w:val="24"/>
+          <w:szCs w:val="24"/>
+          <w:lang w:val="es-ES"/>
+        </w:rPr>
+      </w:pPr>
+      <w:hyperlink r:id="R3f8401fd97014aa5">
+        <w:r>
+          <w:rPr>
+            <w:rStyle w:val="Hyperlink"/>
+            <w:rFonts w:ascii="Arial" w:hAnsi="Arial" w:eastAsia="Arial" w:cs="Arial"/>
+            <w:noProof w:val="0"/>
+            <w:sz w:val="24"/>
+            <w:szCs w:val="24"/>
+            <w:lang w:val="es-ES"/>
+          </w:rPr>
+          <w:t>Pensamiento computacional: ¿qué es y cómo desarrollarlo? (rockcontent.com)</w:t>
+        </w:r>
+      </w:hyperlink>
+    </w:p>
+    <w:p>
+      <w:pPr>
+        <w:pStyle w:val="Normal"/>
+        <w:jc w:val="both"/>
+        <w:rPr>
+          <w:rFonts w:ascii="Arial" w:hAnsi="Arial" w:eastAsia="Arial" w:cs="Arial"/>
+          <w:noProof w:val="0"/>
+          <w:sz w:val="24"/>
+          <w:szCs w:val="24"/>
+          <w:lang w:val="es-ES"/>
+        </w:rPr>
+      </w:pPr>
+      <w:hyperlink r:id="R207ceec37a654531">
+        <w:r>
+          <w:rPr>
+            <w:rStyle w:val="Hyperlink"/>
+            <w:rFonts w:ascii="Arial" w:hAnsi="Arial" w:eastAsia="Arial" w:cs="Arial"/>
+            <w:noProof w:val="0"/>
+            <w:sz w:val="24"/>
+            <w:szCs w:val="24"/>
+            <w:lang w:val="es-ES"/>
+          </w:rPr>
+          <w:t>PensamientoComputacional1.pdf (icesi.edu.co)</w:t>
+        </w:r>
+      </w:hyperlink>
+    </w:p>
+    <w:p>
+      <w:pPr>
+        <w:pStyle w:val="Normal"/>
+        <w:jc w:val="both"/>
+        <w:rPr>
+          <w:rFonts w:ascii="Arial" w:hAnsi="Arial" w:eastAsia="Arial" w:cs="Arial"/>
+          <w:noProof w:val="0"/>
+          <w:sz w:val="24"/>
+          <w:szCs w:val="24"/>
+          <w:lang w:val="es-ES"/>
+        </w:rPr>
+      </w:pPr>
+    </w:p>
+    <w:p>
+      <w:pPr>
+        <w:pStyle w:val="Normal"/>
+        <w:jc w:val="both"/>
         <w:rPr>
           <w:rFonts w:ascii="Arial" w:hAnsi="Arial" w:eastAsia="Arial" w:cs="Arial"/>
           <w:b w:val="1"/>
@@ -415,21 +726,406 @@
     </w:p>
     <w:p>
       <w:pPr>
-        <w:pStyle w:val="Normal"/>
-        <w:rPr>
-          <w:rFonts w:ascii="Arial" w:hAnsi="Arial" w:eastAsia="Arial" w:cs="Arial"/>
-          <w:b w:val="1"/>
-          <w:bCs w:val="1"/>
-          <w:noProof w:val="0"/>
-          <w:sz w:val="24"/>
-          <w:szCs w:val="24"/>
-          <w:lang w:val="es-ES"/>
-        </w:rPr>
-      </w:pPr>
-    </w:p>
-    <w:p>
-      <w:pPr>
-        <w:pStyle w:val="Normal"/>
+        <w:jc w:val="both"/>
+        <w:rPr>
+          <w:rFonts w:ascii="system-ui" w:hAnsi="system-ui" w:eastAsia="system-ui" w:cs="system-ui"/>
+          <w:b w:val="0"/>
+          <w:bCs w:val="0"/>
+          <w:i w:val="0"/>
+          <w:iCs w:val="0"/>
+          <w:caps w:val="0"/>
+          <w:smallCaps w:val="0"/>
+          <w:noProof w:val="0"/>
+          <w:color w:val="374151"/>
+          <w:sz w:val="24"/>
+          <w:szCs w:val="24"/>
+          <w:lang w:val="es-ES"/>
+        </w:rPr>
+      </w:pPr>
+      <w:r>
+        <w:rPr>
+          <w:rFonts w:ascii="system-ui" w:hAnsi="system-ui" w:eastAsia="system-ui" w:cs="system-ui"/>
+          <w:b w:val="0"/>
+          <w:bCs w:val="0"/>
+          <w:i w:val="0"/>
+          <w:iCs w:val="0"/>
+          <w:caps w:val="0"/>
+          <w:smallCaps w:val="0"/>
+          <w:noProof w:val="0"/>
+          <w:color w:val="374151"/>
+          <w:sz w:val="24"/>
+          <w:szCs w:val="24"/>
+          <w:lang w:val="es-ES"/>
+        </w:rPr>
+        <w:t xml:space="preserve">El objetivo de esta propuesta de investigación es desarrollar e implementar un programa de formación en pensamiento computacional utilizando Python y técnicas de Machine </w:t>
+      </w:r>
+      <w:r>
+        <w:rPr>
+          <w:rFonts w:ascii="system-ui" w:hAnsi="system-ui" w:eastAsia="system-ui" w:cs="system-ui"/>
+          <w:b w:val="0"/>
+          <w:bCs w:val="0"/>
+          <w:i w:val="0"/>
+          <w:iCs w:val="0"/>
+          <w:caps w:val="0"/>
+          <w:smallCaps w:val="0"/>
+          <w:noProof w:val="0"/>
+          <w:color w:val="374151"/>
+          <w:sz w:val="24"/>
+          <w:szCs w:val="24"/>
+          <w:lang w:val="es-ES"/>
+        </w:rPr>
+        <w:t>Learning</w:t>
+      </w:r>
+      <w:r>
+        <w:rPr>
+          <w:rFonts w:ascii="system-ui" w:hAnsi="system-ui" w:eastAsia="system-ui" w:cs="system-ui"/>
+          <w:b w:val="0"/>
+          <w:bCs w:val="0"/>
+          <w:i w:val="0"/>
+          <w:iCs w:val="0"/>
+          <w:caps w:val="0"/>
+          <w:smallCaps w:val="0"/>
+          <w:noProof w:val="0"/>
+          <w:color w:val="374151"/>
+          <w:sz w:val="24"/>
+          <w:szCs w:val="24"/>
+          <w:lang w:val="es-ES"/>
+        </w:rPr>
+        <w:t xml:space="preserve">, dirigido a estudiantes de Administración de Empresas. </w:t>
+      </w:r>
+      <w:r>
+        <w:rPr>
+          <w:rFonts w:ascii="system-ui" w:hAnsi="system-ui" w:eastAsia="system-ui" w:cs="system-ui"/>
+          <w:b w:val="0"/>
+          <w:bCs w:val="0"/>
+          <w:i w:val="0"/>
+          <w:iCs w:val="0"/>
+          <w:caps w:val="0"/>
+          <w:smallCaps w:val="0"/>
+          <w:noProof w:val="0"/>
+          <w:color w:val="374151"/>
+          <w:sz w:val="24"/>
+          <w:szCs w:val="24"/>
+          <w:lang w:val="es-ES"/>
+        </w:rPr>
+        <w:t>Mediante esta iniciativa, se busca capacitar a los futuros profesionales para que adquieran habilidades técnicas que les permitan enfrentar los desafíos digitales y tecnológicos que enfrentan las empresas en la actualidad.</w:t>
+      </w:r>
+    </w:p>
+    <w:p>
+      <w:pPr>
+        <w:pStyle w:val="Normal"/>
+        <w:jc w:val="both"/>
+        <w:rPr>
+          <w:rFonts w:ascii="system-ui" w:hAnsi="system-ui" w:eastAsia="system-ui" w:cs="system-ui"/>
+          <w:b w:val="0"/>
+          <w:bCs w:val="0"/>
+          <w:i w:val="0"/>
+          <w:iCs w:val="0"/>
+          <w:caps w:val="0"/>
+          <w:smallCaps w:val="0"/>
+          <w:noProof w:val="0"/>
+          <w:color w:val="374151"/>
+          <w:sz w:val="24"/>
+          <w:szCs w:val="24"/>
+          <w:lang w:val="es-ES"/>
+        </w:rPr>
+      </w:pPr>
+    </w:p>
+    <w:p>
+      <w:pPr>
+        <w:pStyle w:val="Normal"/>
+        <w:jc w:val="both"/>
+        <w:rPr>
+          <w:rFonts w:ascii="system-ui" w:hAnsi="system-ui" w:eastAsia="system-ui" w:cs="system-ui"/>
+          <w:b w:val="0"/>
+          <w:bCs w:val="0"/>
+          <w:i w:val="0"/>
+          <w:iCs w:val="0"/>
+          <w:caps w:val="0"/>
+          <w:smallCaps w:val="0"/>
+          <w:noProof w:val="0"/>
+          <w:color w:val="374151"/>
+          <w:sz w:val="24"/>
+          <w:szCs w:val="24"/>
+          <w:lang w:val="es-ES"/>
+        </w:rPr>
+      </w:pPr>
+      <w:r>
+        <w:rPr>
+          <w:rFonts w:ascii="system-ui" w:hAnsi="system-ui" w:eastAsia="system-ui" w:cs="system-ui"/>
+          <w:b w:val="0"/>
+          <w:bCs w:val="0"/>
+          <w:i w:val="0"/>
+          <w:iCs w:val="0"/>
+          <w:caps w:val="0"/>
+          <w:smallCaps w:val="0"/>
+          <w:noProof w:val="0"/>
+          <w:color w:val="374151"/>
+          <w:sz w:val="24"/>
+          <w:szCs w:val="24"/>
+          <w:lang w:val="es-ES"/>
+        </w:rPr>
+        <w:t>Otro</w:t>
+      </w:r>
+    </w:p>
+    <w:p>
+      <w:pPr>
+        <w:pStyle w:val="Normal"/>
+        <w:jc w:val="both"/>
+        <w:rPr>
+          <w:rFonts w:ascii="system-ui" w:hAnsi="system-ui" w:eastAsia="system-ui" w:cs="system-ui"/>
+          <w:noProof w:val="0"/>
+          <w:sz w:val="24"/>
+          <w:szCs w:val="24"/>
+          <w:lang w:val="es-ES"/>
+        </w:rPr>
+      </w:pPr>
+      <w:r>
+        <w:rPr>
+          <w:rFonts w:ascii="system-ui" w:hAnsi="system-ui" w:eastAsia="system-ui" w:cs="system-ui"/>
+          <w:b w:val="0"/>
+          <w:bCs w:val="0"/>
+          <w:i w:val="0"/>
+          <w:iCs w:val="0"/>
+          <w:caps w:val="0"/>
+          <w:smallCaps w:val="0"/>
+          <w:noProof w:val="0"/>
+          <w:color w:val="374151"/>
+          <w:sz w:val="24"/>
+          <w:szCs w:val="24"/>
+          <w:lang w:val="es-ES"/>
+        </w:rPr>
+        <w:t xml:space="preserve">El objetivo de esta propuesta es evaluar el impacto del programa de formación en pensamiento computacional con Python y Machine </w:t>
+      </w:r>
+      <w:r>
+        <w:rPr>
+          <w:rFonts w:ascii="system-ui" w:hAnsi="system-ui" w:eastAsia="system-ui" w:cs="system-ui"/>
+          <w:b w:val="0"/>
+          <w:bCs w:val="0"/>
+          <w:i w:val="0"/>
+          <w:iCs w:val="0"/>
+          <w:caps w:val="0"/>
+          <w:smallCaps w:val="0"/>
+          <w:noProof w:val="0"/>
+          <w:color w:val="374151"/>
+          <w:sz w:val="24"/>
+          <w:szCs w:val="24"/>
+          <w:lang w:val="es-ES"/>
+        </w:rPr>
+        <w:t>Learning</w:t>
+      </w:r>
+      <w:r>
+        <w:rPr>
+          <w:rFonts w:ascii="system-ui" w:hAnsi="system-ui" w:eastAsia="system-ui" w:cs="system-ui"/>
+          <w:b w:val="0"/>
+          <w:bCs w:val="0"/>
+          <w:i w:val="0"/>
+          <w:iCs w:val="0"/>
+          <w:caps w:val="0"/>
+          <w:smallCaps w:val="0"/>
+          <w:noProof w:val="0"/>
+          <w:color w:val="374151"/>
+          <w:sz w:val="24"/>
+          <w:szCs w:val="24"/>
+          <w:lang w:val="es-ES"/>
+        </w:rPr>
+        <w:t xml:space="preserve"> en estudiantes de Administración de Empresas, mediante un estudio de caso en una institución educativa seleccionada. Se busca determinar cómo esta formación mejora el desarrollo del pensamiento computacional de los estudiantes, su comprensión de conceptos de administración de empresas relacionados con el análisis de datos y toma de decisiones, y su rendimiento académico en asignaturas pertinentes. Los resultados obtenidos proporcionarán información relevante para respaldar la inclusión de esta formación en el currículo académico y preparar a los futuros profesionales para enfrentar los desafíos tecnológicos y digitales en el campo empresarial actual.</w:t>
+      </w:r>
+    </w:p>
+    <w:p>
+      <w:pPr>
+        <w:pStyle w:val="Normal"/>
+        <w:jc w:val="both"/>
+        <w:rPr>
+          <w:rFonts w:ascii="system-ui" w:hAnsi="system-ui" w:eastAsia="system-ui" w:cs="system-ui"/>
+          <w:b w:val="0"/>
+          <w:bCs w:val="0"/>
+          <w:i w:val="0"/>
+          <w:iCs w:val="0"/>
+          <w:caps w:val="0"/>
+          <w:smallCaps w:val="0"/>
+          <w:noProof w:val="0"/>
+          <w:color w:val="374151"/>
+          <w:sz w:val="24"/>
+          <w:szCs w:val="24"/>
+          <w:lang w:val="es-ES"/>
+        </w:rPr>
+      </w:pPr>
+    </w:p>
+    <w:p>
+      <w:pPr>
+        <w:pStyle w:val="Normal"/>
+        <w:jc w:val="both"/>
+        <w:rPr>
+          <w:rFonts w:ascii="system-ui" w:hAnsi="system-ui" w:eastAsia="system-ui" w:cs="system-ui"/>
+          <w:b w:val="0"/>
+          <w:bCs w:val="0"/>
+          <w:i w:val="0"/>
+          <w:iCs w:val="0"/>
+          <w:caps w:val="0"/>
+          <w:smallCaps w:val="0"/>
+          <w:noProof w:val="0"/>
+          <w:color w:val="374151"/>
+          <w:sz w:val="24"/>
+          <w:szCs w:val="24"/>
+          <w:lang w:val="es-ES"/>
+        </w:rPr>
+      </w:pPr>
+      <w:r>
+        <w:rPr>
+          <w:rFonts w:ascii="system-ui" w:hAnsi="system-ui" w:eastAsia="system-ui" w:cs="system-ui"/>
+          <w:b w:val="0"/>
+          <w:bCs w:val="0"/>
+          <w:i w:val="0"/>
+          <w:iCs w:val="0"/>
+          <w:caps w:val="0"/>
+          <w:smallCaps w:val="0"/>
+          <w:noProof w:val="0"/>
+          <w:color w:val="374151"/>
+          <w:sz w:val="24"/>
+          <w:szCs w:val="24"/>
+          <w:lang w:val="es-ES"/>
+        </w:rPr>
+        <w:t>Otro</w:t>
+      </w:r>
+    </w:p>
+    <w:p>
+      <w:pPr>
+        <w:pStyle w:val="Normal"/>
+        <w:jc w:val="both"/>
+        <w:rPr>
+          <w:rFonts w:ascii="system-ui" w:hAnsi="system-ui" w:eastAsia="system-ui" w:cs="system-ui"/>
+          <w:noProof w:val="0"/>
+          <w:sz w:val="24"/>
+          <w:szCs w:val="24"/>
+          <w:lang w:val="es-ES"/>
+        </w:rPr>
+      </w:pPr>
+      <w:r>
+        <w:rPr>
+          <w:rFonts w:ascii="system-ui" w:hAnsi="system-ui" w:eastAsia="system-ui" w:cs="system-ui"/>
+          <w:b w:val="1"/>
+          <w:bCs w:val="1"/>
+          <w:i w:val="0"/>
+          <w:iCs w:val="0"/>
+          <w:caps w:val="0"/>
+          <w:smallCaps w:val="0"/>
+          <w:noProof w:val="0"/>
+          <w:sz w:val="24"/>
+          <w:szCs w:val="24"/>
+          <w:lang w:val="es-ES"/>
+        </w:rPr>
+        <w:t>Objetivo General:</w:t>
+      </w:r>
+      <w:r>
+        <w:rPr>
+          <w:rFonts w:ascii="system-ui" w:hAnsi="system-ui" w:eastAsia="system-ui" w:cs="system-ui"/>
+          <w:b w:val="0"/>
+          <w:bCs w:val="0"/>
+          <w:i w:val="0"/>
+          <w:iCs w:val="0"/>
+          <w:caps w:val="0"/>
+          <w:smallCaps w:val="0"/>
+          <w:noProof w:val="0"/>
+          <w:color w:val="374151"/>
+          <w:sz w:val="24"/>
+          <w:szCs w:val="24"/>
+          <w:lang w:val="es-ES"/>
+        </w:rPr>
+        <w:t xml:space="preserve"> Evaluar el impacto del programa de formación en pensamiento computacional con Python y Machine Learning en estudiantes de Administración de Empresas, para determinar su efectividad en el desarrollo de habilidades técnicas y su aplicación en el ámbito empresarial.</w:t>
+      </w:r>
+    </w:p>
+    <w:p>
+      <w:pPr>
+        <w:pStyle w:val="Normal"/>
+        <w:jc w:val="both"/>
+        <w:rPr>
+          <w:rFonts w:ascii="Arial" w:hAnsi="Arial" w:eastAsia="Arial" w:cs="Arial"/>
+          <w:b w:val="1"/>
+          <w:bCs w:val="1"/>
+          <w:noProof w:val="0"/>
+          <w:sz w:val="24"/>
+          <w:szCs w:val="24"/>
+          <w:lang w:val="es-ES"/>
+        </w:rPr>
+      </w:pPr>
+    </w:p>
+    <w:p>
+      <w:pPr>
+        <w:pStyle w:val="Normal"/>
+        <w:jc w:val="both"/>
+        <w:rPr>
+          <w:rFonts w:ascii="Arial" w:hAnsi="Arial" w:eastAsia="Arial" w:cs="Arial"/>
+          <w:b w:val="1"/>
+          <w:bCs w:val="1"/>
+          <w:noProof w:val="0"/>
+          <w:sz w:val="24"/>
+          <w:szCs w:val="24"/>
+          <w:lang w:val="es-ES"/>
+        </w:rPr>
+      </w:pPr>
+      <w:r>
+        <w:rPr>
+          <w:rFonts w:ascii="Arial" w:hAnsi="Arial" w:eastAsia="Arial" w:cs="Arial"/>
+          <w:b w:val="1"/>
+          <w:bCs w:val="1"/>
+          <w:noProof w:val="0"/>
+          <w:sz w:val="24"/>
+          <w:szCs w:val="24"/>
+          <w:lang w:val="es-ES"/>
+        </w:rPr>
+        <w:t>Otro</w:t>
+      </w:r>
+    </w:p>
+    <w:p>
+      <w:pPr>
+        <w:pStyle w:val="Normal"/>
+        <w:jc w:val="both"/>
+        <w:rPr>
+          <w:rFonts w:ascii="Arial" w:hAnsi="Arial" w:eastAsia="Arial" w:cs="Arial"/>
+          <w:noProof w:val="0"/>
+          <w:sz w:val="24"/>
+          <w:szCs w:val="24"/>
+          <w:lang w:val="es-ES"/>
+        </w:rPr>
+      </w:pPr>
+      <w:r>
+        <w:rPr>
+          <w:rFonts w:ascii="Roboto" w:hAnsi="Roboto" w:eastAsia="Roboto" w:cs="Roboto"/>
+          <w:b w:val="0"/>
+          <w:bCs w:val="0"/>
+          <w:i w:val="0"/>
+          <w:iCs w:val="0"/>
+          <w:caps w:val="0"/>
+          <w:smallCaps w:val="0"/>
+          <w:noProof w:val="0"/>
+          <w:color w:val="111111"/>
+          <w:sz w:val="24"/>
+          <w:szCs w:val="24"/>
+          <w:lang w:val="es-ES"/>
+        </w:rPr>
+        <w:t>“Desarrollar el pensamiento computacional en los estudiantes de Administración de Empresas mediante el uso de Python y Machine Learning”. Un objetivo específico podría ser: “Diseñar e implementar un curso de introducción a Python y Machine Learning para los estudiantes de Administración de Empresas”.</w:t>
+      </w:r>
+    </w:p>
+    <w:p>
+      <w:pPr>
+        <w:pStyle w:val="Normal"/>
+        <w:jc w:val="both"/>
+        <w:rPr>
+          <w:rFonts w:ascii="Arial" w:hAnsi="Arial" w:eastAsia="Arial" w:cs="Arial"/>
+          <w:b w:val="1"/>
+          <w:bCs w:val="1"/>
+          <w:noProof w:val="0"/>
+          <w:sz w:val="24"/>
+          <w:szCs w:val="24"/>
+          <w:lang w:val="es-ES"/>
+        </w:rPr>
+      </w:pPr>
+    </w:p>
+    <w:p>
+      <w:pPr>
+        <w:pStyle w:val="Normal"/>
+        <w:jc w:val="both"/>
         <w:rPr>
           <w:rFonts w:ascii="Arial" w:hAnsi="Arial" w:eastAsia="Arial" w:cs="Arial"/>
           <w:b w:val="1"/>
@@ -456,20 +1152,158 @@
     <w:p>
       <w:pPr>
         <w:pStyle w:val="Normal"/>
-        <w:rPr>
-          <w:rFonts w:ascii="Arial" w:hAnsi="Arial" w:eastAsia="Arial" w:cs="Arial"/>
-          <w:b w:val="1"/>
-          <w:bCs w:val="1"/>
-          <w:noProof w:val="0"/>
-          <w:sz w:val="24"/>
-          <w:szCs w:val="24"/>
-          <w:lang w:val="es-ES"/>
-        </w:rPr>
-      </w:pPr>
-    </w:p>
-    <w:p>
-      <w:pPr>
-        <w:pStyle w:val="Normal"/>
+        <w:jc w:val="both"/>
+        <w:rPr>
+          <w:rFonts w:ascii="Arial" w:hAnsi="Arial" w:eastAsia="Arial" w:cs="Arial"/>
+          <w:noProof w:val="0"/>
+          <w:sz w:val="24"/>
+          <w:szCs w:val="24"/>
+          <w:lang w:val="es-ES"/>
+        </w:rPr>
+      </w:pPr>
+      <w:r>
+        <w:rPr>
+          <w:rFonts w:ascii="system-ui" w:hAnsi="system-ui" w:eastAsia="system-ui" w:cs="system-ui"/>
+          <w:b w:val="0"/>
+          <w:bCs w:val="0"/>
+          <w:i w:val="0"/>
+          <w:iCs w:val="0"/>
+          <w:caps w:val="0"/>
+          <w:smallCaps w:val="0"/>
+          <w:noProof w:val="0"/>
+          <w:color w:val="374151"/>
+          <w:sz w:val="24"/>
+          <w:szCs w:val="24"/>
+          <w:lang w:val="es-ES"/>
+        </w:rPr>
+        <w:t xml:space="preserve">Enfoque metodológico: El presente trabajo se basará en un estudio de caso que permitirá analizar en profundidad el impacto del programa de formación en pensamiento computacional con Python y Machine </w:t>
+      </w:r>
+      <w:r>
+        <w:rPr>
+          <w:rFonts w:ascii="system-ui" w:hAnsi="system-ui" w:eastAsia="system-ui" w:cs="system-ui"/>
+          <w:b w:val="0"/>
+          <w:bCs w:val="0"/>
+          <w:i w:val="0"/>
+          <w:iCs w:val="0"/>
+          <w:caps w:val="0"/>
+          <w:smallCaps w:val="0"/>
+          <w:noProof w:val="0"/>
+          <w:color w:val="374151"/>
+          <w:sz w:val="24"/>
+          <w:szCs w:val="24"/>
+          <w:lang w:val="es-ES"/>
+        </w:rPr>
+        <w:t>Learning</w:t>
+      </w:r>
+      <w:r>
+        <w:rPr>
+          <w:rFonts w:ascii="system-ui" w:hAnsi="system-ui" w:eastAsia="system-ui" w:cs="system-ui"/>
+          <w:b w:val="0"/>
+          <w:bCs w:val="0"/>
+          <w:i w:val="0"/>
+          <w:iCs w:val="0"/>
+          <w:caps w:val="0"/>
+          <w:smallCaps w:val="0"/>
+          <w:noProof w:val="0"/>
+          <w:color w:val="374151"/>
+          <w:sz w:val="24"/>
+          <w:szCs w:val="24"/>
+          <w:lang w:val="es-ES"/>
+        </w:rPr>
+        <w:t xml:space="preserve"> en un grupo específico de estudiantes de Administración de Empresas.</w:t>
+      </w:r>
+    </w:p>
+    <w:p>
+      <w:pPr>
+        <w:pStyle w:val="Normal"/>
+        <w:jc w:val="both"/>
+        <w:rPr>
+          <w:rFonts w:ascii="Arial" w:hAnsi="Arial" w:eastAsia="Arial" w:cs="Arial"/>
+          <w:b w:val="1"/>
+          <w:bCs w:val="1"/>
+          <w:noProof w:val="0"/>
+          <w:sz w:val="24"/>
+          <w:szCs w:val="24"/>
+          <w:lang w:val="es-ES"/>
+        </w:rPr>
+      </w:pPr>
+    </w:p>
+    <w:p>
+      <w:pPr>
+        <w:pStyle w:val="Normal"/>
+        <w:jc w:val="both"/>
+        <w:rPr>
+          <w:rFonts w:ascii="Arial" w:hAnsi="Arial" w:eastAsia="Arial" w:cs="Arial"/>
+          <w:b w:val="1"/>
+          <w:bCs w:val="1"/>
+          <w:noProof w:val="0"/>
+          <w:sz w:val="24"/>
+          <w:szCs w:val="24"/>
+          <w:lang w:val="es-ES"/>
+        </w:rPr>
+      </w:pPr>
+      <w:r>
+        <w:rPr>
+          <w:rFonts w:ascii="Arial" w:hAnsi="Arial" w:eastAsia="Arial" w:cs="Arial"/>
+          <w:b w:val="1"/>
+          <w:bCs w:val="1"/>
+          <w:noProof w:val="0"/>
+          <w:sz w:val="24"/>
+          <w:szCs w:val="24"/>
+          <w:lang w:val="es-ES"/>
+        </w:rPr>
+        <w:t>Otro</w:t>
+      </w:r>
+    </w:p>
+    <w:p>
+      <w:pPr>
+        <w:pStyle w:val="Normal"/>
+        <w:jc w:val="both"/>
+        <w:rPr>
+          <w:rFonts w:ascii="Arial" w:hAnsi="Arial" w:eastAsia="Arial" w:cs="Arial"/>
+          <w:noProof w:val="0"/>
+          <w:sz w:val="24"/>
+          <w:szCs w:val="24"/>
+          <w:lang w:val="es-ES"/>
+        </w:rPr>
+      </w:pPr>
+      <w:r>
+        <w:rPr>
+          <w:rFonts w:ascii="Roboto" w:hAnsi="Roboto" w:eastAsia="Roboto" w:cs="Roboto"/>
+          <w:b w:val="0"/>
+          <w:bCs w:val="0"/>
+          <w:i w:val="0"/>
+          <w:iCs w:val="0"/>
+          <w:caps w:val="0"/>
+          <w:smallCaps w:val="0"/>
+          <w:noProof w:val="0"/>
+          <w:color w:val="111111"/>
+          <w:sz w:val="24"/>
+          <w:szCs w:val="24"/>
+          <w:lang w:val="es-ES"/>
+        </w:rPr>
+        <w:t>estudio cuasiexperimental, con un grupo experimental y un grupo control, aplicando un pretest y un postest para medir el nivel de pensamiento computacional antes y después del curso. Podrías utilizar cuestionarios, entrevistas o pruebas estandarizadas como instrumentos de recolección de datos. Podrías utilizar técnicas estadísticas como la prueba t o el análisis de varianza para comparar los resultados entre los grupos.</w:t>
+      </w:r>
+    </w:p>
+    <w:p>
+      <w:pPr>
+        <w:pStyle w:val="Normal"/>
+        <w:jc w:val="both"/>
+        <w:rPr>
+          <w:rFonts w:ascii="Arial" w:hAnsi="Arial" w:eastAsia="Arial" w:cs="Arial"/>
+          <w:b w:val="1"/>
+          <w:bCs w:val="1"/>
+          <w:noProof w:val="0"/>
+          <w:sz w:val="24"/>
+          <w:szCs w:val="24"/>
+          <w:lang w:val="es-ES"/>
+        </w:rPr>
+      </w:pPr>
+    </w:p>
+    <w:p>
+      <w:pPr>
+        <w:pStyle w:val="Normal"/>
+        <w:jc w:val="both"/>
         <w:rPr>
           <w:rFonts w:ascii="Arial" w:hAnsi="Arial" w:eastAsia="Arial" w:cs="Arial"/>
           <w:b w:val="1"/>
@@ -495,45 +1329,740 @@
     </w:p>
     <w:p>
       <w:pPr>
-        <w:pStyle w:val="Normal"/>
-        <w:rPr>
-          <w:rFonts w:ascii="Arial" w:hAnsi="Arial" w:eastAsia="Arial" w:cs="Arial"/>
-          <w:b w:val="1"/>
-          <w:bCs w:val="1"/>
-          <w:noProof w:val="0"/>
-          <w:sz w:val="24"/>
-          <w:szCs w:val="24"/>
-          <w:lang w:val="es-ES"/>
-        </w:rPr>
-      </w:pPr>
-    </w:p>
-    <w:p>
-      <w:pPr>
-        <w:pStyle w:val="Normal"/>
-        <w:rPr>
-          <w:rFonts w:ascii="Arial" w:hAnsi="Arial" w:eastAsia="Arial" w:cs="Arial"/>
-          <w:b w:val="1"/>
-          <w:bCs w:val="1"/>
-          <w:noProof w:val="0"/>
-          <w:sz w:val="24"/>
-          <w:szCs w:val="24"/>
-          <w:lang w:val="es-ES"/>
-        </w:rPr>
-      </w:pPr>
-    </w:p>
-    <w:p>
-      <w:pPr>
-        <w:pStyle w:val="Normal"/>
-        <w:rPr>
-          <w:rFonts w:ascii="Arial" w:hAnsi="Arial" w:eastAsia="Arial" w:cs="Arial"/>
-          <w:b w:val="1"/>
-          <w:bCs w:val="1"/>
-          <w:noProof w:val="0"/>
-          <w:sz w:val="24"/>
-          <w:szCs w:val="24"/>
-          <w:lang w:val="es-ES"/>
-        </w:rPr>
-      </w:pPr>
+        <w:jc w:val="both"/>
+      </w:pPr>
+      <w:r>
+        <w:rPr>
+          <w:rFonts w:ascii="system-ui" w:hAnsi="system-ui" w:eastAsia="system-ui" w:cs="system-ui"/>
+          <w:b w:val="0"/>
+          <w:bCs w:val="0"/>
+          <w:i w:val="0"/>
+          <w:iCs w:val="0"/>
+          <w:caps w:val="0"/>
+          <w:smallCaps w:val="0"/>
+          <w:noProof w:val="0"/>
+          <w:color w:val="374151"/>
+          <w:sz w:val="24"/>
+          <w:szCs w:val="24"/>
+          <w:lang w:val="es-ES"/>
+        </w:rPr>
+        <w:t xml:space="preserve">Los resultados revelaron que el grupo de estudiantes que recibió la formación en pensamiento computacional con Python y Machine </w:t>
+      </w:r>
+      <w:r>
+        <w:rPr>
+          <w:rFonts w:ascii="system-ui" w:hAnsi="system-ui" w:eastAsia="system-ui" w:cs="system-ui"/>
+          <w:b w:val="0"/>
+          <w:bCs w:val="0"/>
+          <w:i w:val="0"/>
+          <w:iCs w:val="0"/>
+          <w:caps w:val="0"/>
+          <w:smallCaps w:val="0"/>
+          <w:noProof w:val="0"/>
+          <w:color w:val="374151"/>
+          <w:sz w:val="24"/>
+          <w:szCs w:val="24"/>
+          <w:lang w:val="es-ES"/>
+        </w:rPr>
+        <w:t>Learning</w:t>
+      </w:r>
+      <w:r>
+        <w:rPr>
+          <w:rFonts w:ascii="system-ui" w:hAnsi="system-ui" w:eastAsia="system-ui" w:cs="system-ui"/>
+          <w:b w:val="0"/>
+          <w:bCs w:val="0"/>
+          <w:i w:val="0"/>
+          <w:iCs w:val="0"/>
+          <w:caps w:val="0"/>
+          <w:smallCaps w:val="0"/>
+          <w:noProof w:val="0"/>
+          <w:color w:val="374151"/>
+          <w:sz w:val="24"/>
+          <w:szCs w:val="24"/>
+          <w:lang w:val="es-ES"/>
+        </w:rPr>
+        <w:t xml:space="preserve"> mostró una mejora significativa en sus habilidades de resolución de problemas, análisis de datos y toma de decisiones en comparación con el grupo de control. Esta mejora se reflejó en los puntajes más altos obtenidos en las pruebas y cuestionarios post formación.</w:t>
+      </w:r>
+    </w:p>
+    <w:p>
+      <w:pPr>
+        <w:jc w:val="both"/>
+        <w:rPr>
+          <w:rFonts w:ascii="system-ui" w:hAnsi="system-ui" w:eastAsia="system-ui" w:cs="system-ui"/>
+          <w:b w:val="0"/>
+          <w:bCs w:val="0"/>
+          <w:i w:val="0"/>
+          <w:iCs w:val="0"/>
+          <w:caps w:val="0"/>
+          <w:smallCaps w:val="0"/>
+          <w:noProof w:val="0"/>
+          <w:color w:val="374151"/>
+          <w:sz w:val="24"/>
+          <w:szCs w:val="24"/>
+          <w:lang w:val="es-ES"/>
+        </w:rPr>
+      </w:pPr>
+      <w:r>
+        <w:rPr>
+          <w:rFonts w:ascii="system-ui" w:hAnsi="system-ui" w:eastAsia="system-ui" w:cs="system-ui"/>
+          <w:b w:val="0"/>
+          <w:bCs w:val="0"/>
+          <w:i w:val="0"/>
+          <w:iCs w:val="0"/>
+          <w:caps w:val="0"/>
+          <w:smallCaps w:val="0"/>
+          <w:noProof w:val="0"/>
+          <w:color w:val="374151"/>
+          <w:sz w:val="24"/>
+          <w:szCs w:val="24"/>
+          <w:lang w:val="es-ES"/>
+        </w:rPr>
+        <w:t>La implementación del programa de formación demostró ser efectiva para desarrollar el pensamiento computacional de los estudiantes de Administración de Empresas, lo que sugiere que este enfoque pedagógico puede ser de gran utilidad para preparar a los futuros profesionales en un entorno empresarial cada vez más digitalizado y tecnológico.</w:t>
+      </w:r>
+    </w:p>
+    <w:p>
+      <w:pPr>
+        <w:pStyle w:val="Normal"/>
+        <w:jc w:val="both"/>
+        <w:rPr>
+          <w:rFonts w:ascii="Arial" w:hAnsi="Arial" w:eastAsia="Arial" w:cs="Arial"/>
+          <w:b w:val="1"/>
+          <w:bCs w:val="1"/>
+          <w:noProof w:val="0"/>
+          <w:sz w:val="24"/>
+          <w:szCs w:val="24"/>
+          <w:lang w:val="es-ES"/>
+        </w:rPr>
+      </w:pPr>
+    </w:p>
+    <w:p>
+      <w:pPr>
+        <w:pStyle w:val="Normal"/>
+        <w:jc w:val="both"/>
+        <w:rPr>
+          <w:rFonts w:ascii="Arial" w:hAnsi="Arial" w:eastAsia="Arial" w:cs="Arial"/>
+          <w:b w:val="1"/>
+          <w:bCs w:val="1"/>
+          <w:noProof w:val="0"/>
+          <w:sz w:val="24"/>
+          <w:szCs w:val="24"/>
+          <w:lang w:val="es-ES"/>
+        </w:rPr>
+      </w:pPr>
+      <w:r>
+        <w:rPr>
+          <w:rFonts w:ascii="Arial" w:hAnsi="Arial" w:eastAsia="Arial" w:cs="Arial"/>
+          <w:b w:val="1"/>
+          <w:bCs w:val="1"/>
+          <w:noProof w:val="0"/>
+          <w:sz w:val="24"/>
+          <w:szCs w:val="24"/>
+          <w:lang w:val="es-ES"/>
+        </w:rPr>
+        <w:t>____</w:t>
+      </w:r>
+    </w:p>
+    <w:p>
+      <w:pPr>
+        <w:pStyle w:val="Normal"/>
+        <w:jc w:val="both"/>
+        <w:rPr>
+          <w:rFonts w:ascii="Arial" w:hAnsi="Arial" w:eastAsia="Arial" w:cs="Arial"/>
+          <w:noProof w:val="0"/>
+          <w:sz w:val="24"/>
+          <w:szCs w:val="24"/>
+          <w:lang w:val="es-ES"/>
+        </w:rPr>
+      </w:pPr>
+      <w:r>
+        <w:rPr>
+          <w:rFonts w:ascii="system-ui" w:hAnsi="system-ui" w:eastAsia="system-ui" w:cs="system-ui"/>
+          <w:b w:val="0"/>
+          <w:bCs w:val="0"/>
+          <w:i w:val="0"/>
+          <w:iCs w:val="0"/>
+          <w:caps w:val="0"/>
+          <w:smallCaps w:val="0"/>
+          <w:noProof w:val="0"/>
+          <w:color w:val="374151"/>
+          <w:sz w:val="24"/>
+          <w:szCs w:val="24"/>
+          <w:lang w:val="es-ES"/>
+        </w:rPr>
+        <w:t xml:space="preserve">El programa de formación en pensamiento computacional con Python y Machine </w:t>
+      </w:r>
+      <w:r>
+        <w:rPr>
+          <w:rFonts w:ascii="system-ui" w:hAnsi="system-ui" w:eastAsia="system-ui" w:cs="system-ui"/>
+          <w:b w:val="0"/>
+          <w:bCs w:val="0"/>
+          <w:i w:val="0"/>
+          <w:iCs w:val="0"/>
+          <w:caps w:val="0"/>
+          <w:smallCaps w:val="0"/>
+          <w:noProof w:val="0"/>
+          <w:color w:val="374151"/>
+          <w:sz w:val="24"/>
+          <w:szCs w:val="24"/>
+          <w:lang w:val="es-ES"/>
+        </w:rPr>
+        <w:t>Learning</w:t>
+      </w:r>
+      <w:r>
+        <w:rPr>
+          <w:rFonts w:ascii="system-ui" w:hAnsi="system-ui" w:eastAsia="system-ui" w:cs="system-ui"/>
+          <w:b w:val="0"/>
+          <w:bCs w:val="0"/>
+          <w:i w:val="0"/>
+          <w:iCs w:val="0"/>
+          <w:caps w:val="0"/>
+          <w:smallCaps w:val="0"/>
+          <w:noProof w:val="0"/>
+          <w:color w:val="374151"/>
+          <w:sz w:val="24"/>
+          <w:szCs w:val="24"/>
+          <w:lang w:val="es-ES"/>
+        </w:rPr>
+        <w:t xml:space="preserve"> condujo a un claro desarrollo de las habilidades de pensamiento computacional entre los estudiantes de Administración de Empresas, quienes mostraron una mejora significativa en la descomposición de problemas, identificación de patrones y algoritmos. Además, lograron una mayor comprensión de conceptos de administración de empresas relacionados con el análisis de datos y la toma de decisiones, lo que se reflejó en su mejor rendimiento académico en asignaturas pertinentes.</w:t>
+      </w:r>
+    </w:p>
+    <w:p>
+      <w:pPr>
+        <w:pStyle w:val="Normal"/>
+        <w:jc w:val="both"/>
+        <w:rPr>
+          <w:rFonts w:ascii="system-ui" w:hAnsi="system-ui" w:eastAsia="system-ui" w:cs="system-ui"/>
+          <w:b w:val="0"/>
+          <w:bCs w:val="0"/>
+          <w:i w:val="0"/>
+          <w:iCs w:val="0"/>
+          <w:caps w:val="0"/>
+          <w:smallCaps w:val="0"/>
+          <w:noProof w:val="0"/>
+          <w:color w:val="374151"/>
+          <w:sz w:val="24"/>
+          <w:szCs w:val="24"/>
+          <w:lang w:val="es-ES"/>
+        </w:rPr>
+      </w:pPr>
+    </w:p>
+    <w:p>
+      <w:pPr>
+        <w:pStyle w:val="Normal"/>
+        <w:jc w:val="both"/>
+        <w:rPr>
+          <w:rFonts w:ascii="system-ui" w:hAnsi="system-ui" w:eastAsia="system-ui" w:cs="system-ui"/>
+          <w:b w:val="0"/>
+          <w:bCs w:val="0"/>
+          <w:i w:val="0"/>
+          <w:iCs w:val="0"/>
+          <w:caps w:val="0"/>
+          <w:smallCaps w:val="0"/>
+          <w:noProof w:val="0"/>
+          <w:color w:val="374151"/>
+          <w:sz w:val="24"/>
+          <w:szCs w:val="24"/>
+          <w:lang w:val="es-ES"/>
+        </w:rPr>
+      </w:pPr>
+      <w:r>
+        <w:rPr>
+          <w:rFonts w:ascii="system-ui" w:hAnsi="system-ui" w:eastAsia="system-ui" w:cs="system-ui"/>
+          <w:b w:val="0"/>
+          <w:bCs w:val="0"/>
+          <w:i w:val="0"/>
+          <w:iCs w:val="0"/>
+          <w:caps w:val="0"/>
+          <w:smallCaps w:val="0"/>
+          <w:noProof w:val="0"/>
+          <w:color w:val="374151"/>
+          <w:sz w:val="24"/>
+          <w:szCs w:val="24"/>
+          <w:lang w:val="es-ES"/>
+        </w:rPr>
+        <w:t>___</w:t>
+      </w:r>
+    </w:p>
+    <w:p>
+      <w:pPr>
+        <w:pStyle w:val="Normal"/>
+        <w:jc w:val="both"/>
+        <w:rPr>
+          <w:rFonts w:ascii="Arial" w:hAnsi="Arial" w:eastAsia="Arial" w:cs="Arial"/>
+          <w:noProof w:val="0"/>
+          <w:sz w:val="24"/>
+          <w:szCs w:val="24"/>
+          <w:lang w:val="es-ES"/>
+        </w:rPr>
+      </w:pPr>
+      <w:r>
+        <w:rPr>
+          <w:rFonts w:ascii="Arial" w:hAnsi="Arial" w:eastAsia="Arial" w:cs="Arial"/>
+          <w:b w:val="0"/>
+          <w:bCs w:val="0"/>
+          <w:i w:val="0"/>
+          <w:iCs w:val="0"/>
+          <w:caps w:val="0"/>
+          <w:smallCaps w:val="0"/>
+          <w:noProof w:val="0"/>
+          <w:color w:val="1F1F1F"/>
+          <w:sz w:val="24"/>
+          <w:szCs w:val="24"/>
+          <w:lang w:val="es-ES"/>
+        </w:rPr>
+        <w:t>Los resultados del estudio proporcionan evidencia del valor del desarrollo del pensamiento computacional en los estudiantes de administración de empresas. El desarrollo del pensamiento computacional puede ayudar a los estudiantes a desarrollar las habilidades que necesitan para ser exitosos en el mundo actual.</w:t>
+      </w:r>
+    </w:p>
+    <w:p>
+      <w:pPr>
+        <w:pStyle w:val="Normal"/>
+        <w:jc w:val="both"/>
+        <w:rPr>
+          <w:rFonts w:ascii="Arial" w:hAnsi="Arial" w:eastAsia="Arial" w:cs="Arial"/>
+          <w:b w:val="0"/>
+          <w:bCs w:val="0"/>
+          <w:i w:val="0"/>
+          <w:iCs w:val="0"/>
+          <w:caps w:val="0"/>
+          <w:smallCaps w:val="0"/>
+          <w:noProof w:val="0"/>
+          <w:color w:val="1F1F1F"/>
+          <w:sz w:val="24"/>
+          <w:szCs w:val="24"/>
+          <w:lang w:val="es-ES"/>
+        </w:rPr>
+      </w:pPr>
+    </w:p>
+    <w:p>
+      <w:pPr>
+        <w:pStyle w:val="Normal"/>
+        <w:ind w:left="0"/>
+        <w:jc w:val="both"/>
+        <w:rPr>
+          <w:rFonts w:ascii="Arial" w:hAnsi="Arial" w:eastAsia="Arial" w:cs="Arial"/>
+          <w:b w:val="1"/>
+          <w:bCs w:val="1"/>
+          <w:noProof w:val="0"/>
+          <w:sz w:val="24"/>
+          <w:szCs w:val="24"/>
+          <w:lang w:val="es-ES"/>
+        </w:rPr>
+      </w:pPr>
+      <w:r>
+        <w:rPr>
+          <w:rFonts w:ascii="Arial" w:hAnsi="Arial" w:eastAsia="Arial" w:cs="Arial"/>
+          <w:b w:val="1"/>
+          <w:bCs w:val="1"/>
+          <w:noProof w:val="0"/>
+          <w:sz w:val="24"/>
+          <w:szCs w:val="24"/>
+          <w:lang w:val="es-ES"/>
+        </w:rPr>
+        <w:t>Discusión</w:t>
+      </w:r>
+    </w:p>
+    <w:p>
+      <w:pPr>
+        <w:pStyle w:val="Normal"/>
+        <w:ind w:left="0"/>
+        <w:jc w:val="both"/>
+        <w:rPr>
+          <w:rFonts w:ascii="Arial" w:hAnsi="Arial" w:eastAsia="Arial" w:cs="Arial"/>
+          <w:noProof w:val="0"/>
+          <w:sz w:val="24"/>
+          <w:szCs w:val="24"/>
+          <w:lang w:val="es-ES"/>
+        </w:rPr>
+      </w:pPr>
+      <w:r>
+        <w:rPr>
+          <w:rFonts w:ascii="system-ui" w:hAnsi="system-ui" w:eastAsia="system-ui" w:cs="system-ui"/>
+          <w:b w:val="0"/>
+          <w:bCs w:val="0"/>
+          <w:i w:val="0"/>
+          <w:iCs w:val="0"/>
+          <w:caps w:val="0"/>
+          <w:smallCaps w:val="0"/>
+          <w:noProof w:val="0"/>
+          <w:color w:val="374151"/>
+          <w:sz w:val="24"/>
+          <w:szCs w:val="24"/>
+          <w:lang w:val="es-ES"/>
+        </w:rPr>
+        <w:t xml:space="preserve">Los resultados destacan la relevancia del pensamiento computacional como una habilidad esencial en el campo empresarial actual, donde el análisis de datos y el Machine </w:t>
+      </w:r>
+      <w:r>
+        <w:rPr>
+          <w:rFonts w:ascii="system-ui" w:hAnsi="system-ui" w:eastAsia="system-ui" w:cs="system-ui"/>
+          <w:b w:val="0"/>
+          <w:bCs w:val="0"/>
+          <w:i w:val="0"/>
+          <w:iCs w:val="0"/>
+          <w:caps w:val="0"/>
+          <w:smallCaps w:val="0"/>
+          <w:noProof w:val="0"/>
+          <w:color w:val="374151"/>
+          <w:sz w:val="24"/>
+          <w:szCs w:val="24"/>
+          <w:lang w:val="es-ES"/>
+        </w:rPr>
+        <w:t>Learning</w:t>
+      </w:r>
+      <w:r>
+        <w:rPr>
+          <w:rFonts w:ascii="system-ui" w:hAnsi="system-ui" w:eastAsia="system-ui" w:cs="system-ui"/>
+          <w:b w:val="0"/>
+          <w:bCs w:val="0"/>
+          <w:i w:val="0"/>
+          <w:iCs w:val="0"/>
+          <w:caps w:val="0"/>
+          <w:smallCaps w:val="0"/>
+          <w:noProof w:val="0"/>
+          <w:color w:val="374151"/>
+          <w:sz w:val="24"/>
+          <w:szCs w:val="24"/>
+          <w:lang w:val="es-ES"/>
+        </w:rPr>
+        <w:t xml:space="preserve"> se han vuelto cruciales. La aplicación de estas habilidades puede proporcionar una ventaja competitiva y permitir a las organizaciones tomar decisiones informadas y estratégicas. La formación en pensamiento computacional debe ser considerada como parte integral del currículo académico de la Administración de Empresas para preparar a los estudiantes para los desafíos del mundo laboral.</w:t>
+      </w:r>
+    </w:p>
+    <w:p>
+      <w:pPr>
+        <w:pStyle w:val="Normal"/>
+        <w:ind w:left="0"/>
+        <w:jc w:val="both"/>
+        <w:rPr>
+          <w:rFonts w:ascii="system-ui" w:hAnsi="system-ui" w:eastAsia="system-ui" w:cs="system-ui"/>
+          <w:b w:val="0"/>
+          <w:bCs w:val="0"/>
+          <w:i w:val="0"/>
+          <w:iCs w:val="0"/>
+          <w:caps w:val="0"/>
+          <w:smallCaps w:val="0"/>
+          <w:noProof w:val="0"/>
+          <w:color w:val="374151"/>
+          <w:sz w:val="24"/>
+          <w:szCs w:val="24"/>
+          <w:lang w:val="es-ES"/>
+        </w:rPr>
+      </w:pPr>
+    </w:p>
+    <w:p>
+      <w:pPr>
+        <w:pStyle w:val="Normal"/>
+        <w:ind w:left="0"/>
+        <w:jc w:val="both"/>
+        <w:rPr>
+          <w:rFonts w:ascii="system-ui" w:hAnsi="system-ui" w:eastAsia="system-ui" w:cs="system-ui"/>
+          <w:b w:val="0"/>
+          <w:bCs w:val="0"/>
+          <w:i w:val="0"/>
+          <w:iCs w:val="0"/>
+          <w:caps w:val="0"/>
+          <w:smallCaps w:val="0"/>
+          <w:noProof w:val="0"/>
+          <w:color w:val="374151"/>
+          <w:sz w:val="24"/>
+          <w:szCs w:val="24"/>
+          <w:lang w:val="es-ES"/>
+        </w:rPr>
+      </w:pPr>
+      <w:r>
+        <w:rPr>
+          <w:rFonts w:ascii="system-ui" w:hAnsi="system-ui" w:eastAsia="system-ui" w:cs="system-ui"/>
+          <w:b w:val="0"/>
+          <w:bCs w:val="0"/>
+          <w:i w:val="0"/>
+          <w:iCs w:val="0"/>
+          <w:caps w:val="0"/>
+          <w:smallCaps w:val="0"/>
+          <w:noProof w:val="0"/>
+          <w:color w:val="374151"/>
+          <w:sz w:val="24"/>
+          <w:szCs w:val="24"/>
+          <w:lang w:val="es-ES"/>
+        </w:rPr>
+        <w:t>Otro</w:t>
+      </w:r>
+    </w:p>
+    <w:p>
+      <w:pPr>
+        <w:pStyle w:val="Normal"/>
+        <w:ind w:left="0"/>
+        <w:jc w:val="both"/>
+        <w:rPr>
+          <w:rFonts w:ascii="Roboto" w:hAnsi="Roboto" w:eastAsia="Roboto" w:cs="Roboto"/>
+          <w:b w:val="0"/>
+          <w:bCs w:val="0"/>
+          <w:i w:val="0"/>
+          <w:iCs w:val="0"/>
+          <w:caps w:val="0"/>
+          <w:smallCaps w:val="0"/>
+          <w:noProof w:val="0"/>
+          <w:color w:val="111111"/>
+          <w:sz w:val="24"/>
+          <w:szCs w:val="24"/>
+          <w:lang w:val="es-ES"/>
+        </w:rPr>
+      </w:pPr>
+      <w:r>
+        <w:rPr>
+          <w:rFonts w:ascii="Roboto" w:hAnsi="Roboto" w:eastAsia="Roboto" w:cs="Roboto"/>
+          <w:b w:val="0"/>
+          <w:bCs w:val="0"/>
+          <w:i w:val="0"/>
+          <w:iCs w:val="0"/>
+          <w:caps w:val="0"/>
+          <w:smallCaps w:val="0"/>
+          <w:noProof w:val="0"/>
+          <w:color w:val="111111"/>
+          <w:sz w:val="24"/>
+          <w:szCs w:val="24"/>
+          <w:lang w:val="es-ES"/>
+        </w:rPr>
+        <w:t xml:space="preserve">el pensamiento computacional es una habilidad esencial para los estudiantes de Administración de Empresas en el siglo XXI, que Python y Machine </w:t>
+      </w:r>
+      <w:r>
+        <w:rPr>
+          <w:rFonts w:ascii="Roboto" w:hAnsi="Roboto" w:eastAsia="Roboto" w:cs="Roboto"/>
+          <w:b w:val="0"/>
+          <w:bCs w:val="0"/>
+          <w:i w:val="0"/>
+          <w:iCs w:val="0"/>
+          <w:caps w:val="0"/>
+          <w:smallCaps w:val="0"/>
+          <w:noProof w:val="0"/>
+          <w:color w:val="111111"/>
+          <w:sz w:val="24"/>
+          <w:szCs w:val="24"/>
+          <w:lang w:val="es-ES"/>
+        </w:rPr>
+        <w:t>Learning</w:t>
+      </w:r>
+      <w:r>
+        <w:rPr>
+          <w:rFonts w:ascii="Roboto" w:hAnsi="Roboto" w:eastAsia="Roboto" w:cs="Roboto"/>
+          <w:b w:val="0"/>
+          <w:bCs w:val="0"/>
+          <w:i w:val="0"/>
+          <w:iCs w:val="0"/>
+          <w:caps w:val="0"/>
+          <w:smallCaps w:val="0"/>
+          <w:noProof w:val="0"/>
+          <w:color w:val="111111"/>
+          <w:sz w:val="24"/>
+          <w:szCs w:val="24"/>
+          <w:lang w:val="es-ES"/>
+        </w:rPr>
+        <w:t xml:space="preserve"> son herramientas adecuadas para desarrollarlo y que se requieren más estudios para evaluar su impacto a largo </w:t>
+      </w:r>
+      <w:r>
+        <w:rPr>
+          <w:rFonts w:ascii="Roboto" w:hAnsi="Roboto" w:eastAsia="Roboto" w:cs="Roboto"/>
+          <w:b w:val="0"/>
+          <w:bCs w:val="0"/>
+          <w:i w:val="0"/>
+          <w:iCs w:val="0"/>
+          <w:caps w:val="0"/>
+          <w:smallCaps w:val="0"/>
+          <w:noProof w:val="0"/>
+          <w:color w:val="111111"/>
+          <w:sz w:val="24"/>
+          <w:szCs w:val="24"/>
+          <w:lang w:val="es-ES"/>
+        </w:rPr>
+        <w:t>plazo.</w:t>
+      </w:r>
+      <w:r>
+        <w:rPr>
+          <w:rFonts w:ascii="Roboto" w:hAnsi="Roboto" w:eastAsia="Roboto" w:cs="Roboto"/>
+          <w:b w:val="0"/>
+          <w:bCs w:val="0"/>
+          <w:i w:val="0"/>
+          <w:iCs w:val="0"/>
+          <w:caps w:val="0"/>
+          <w:smallCaps w:val="0"/>
+          <w:noProof w:val="0"/>
+          <w:color w:val="111111"/>
+          <w:sz w:val="24"/>
+          <w:szCs w:val="24"/>
+          <w:lang w:val="es-ES"/>
+        </w:rPr>
+        <w:t>--</w:t>
+      </w:r>
+      <w:r>
+        <w:rPr>
+          <w:rFonts w:ascii="Roboto" w:hAnsi="Roboto" w:eastAsia="Roboto" w:cs="Roboto"/>
+          <w:b w:val="0"/>
+          <w:bCs w:val="0"/>
+          <w:i w:val="0"/>
+          <w:iCs w:val="0"/>
+          <w:caps w:val="0"/>
+          <w:smallCaps w:val="0"/>
+          <w:noProof w:val="0"/>
+          <w:color w:val="111111"/>
+          <w:sz w:val="24"/>
+          <w:szCs w:val="24"/>
+          <w:lang w:val="es-ES"/>
+        </w:rPr>
+        <w:t xml:space="preserve"> t</w:t>
+      </w:r>
+      <w:r>
+        <w:rPr>
+          <w:rFonts w:ascii="Roboto" w:hAnsi="Roboto" w:eastAsia="Roboto" w:cs="Roboto"/>
+          <w:b w:val="1"/>
+          <w:bCs w:val="1"/>
+          <w:i w:val="0"/>
+          <w:iCs w:val="0"/>
+          <w:caps w:val="0"/>
+          <w:smallCaps w:val="0"/>
+          <w:noProof w:val="0"/>
+          <w:color w:val="111111"/>
+          <w:sz w:val="24"/>
+          <w:szCs w:val="24"/>
+          <w:lang w:val="es-ES"/>
+        </w:rPr>
+        <w:t>ambién puede ser conclusión.</w:t>
+      </w:r>
+    </w:p>
+    <w:p>
+      <w:pPr>
+        <w:pStyle w:val="Normal"/>
+        <w:ind w:left="0"/>
+        <w:jc w:val="both"/>
+        <w:rPr>
+          <w:rFonts w:ascii="Arial" w:hAnsi="Arial" w:eastAsia="Arial" w:cs="Arial"/>
+          <w:b w:val="1"/>
+          <w:bCs w:val="1"/>
+          <w:noProof w:val="0"/>
+          <w:sz w:val="24"/>
+          <w:szCs w:val="24"/>
+          <w:lang w:val="es-ES"/>
+        </w:rPr>
+      </w:pPr>
+    </w:p>
+    <w:p>
+      <w:pPr>
+        <w:pStyle w:val="Normal"/>
+        <w:ind w:left="0"/>
+        <w:jc w:val="both"/>
+        <w:rPr>
+          <w:rFonts w:ascii="Arial" w:hAnsi="Arial" w:eastAsia="Arial" w:cs="Arial"/>
+          <w:b w:val="1"/>
+          <w:bCs w:val="1"/>
+          <w:noProof w:val="0"/>
+          <w:sz w:val="24"/>
+          <w:szCs w:val="24"/>
+          <w:lang w:val="es-ES"/>
+        </w:rPr>
+      </w:pPr>
+    </w:p>
+    <w:p>
+      <w:pPr>
+        <w:pStyle w:val="Normal"/>
+        <w:ind w:left="0"/>
+        <w:jc w:val="both"/>
+        <w:rPr>
+          <w:rFonts w:ascii="Arial" w:hAnsi="Arial" w:eastAsia="Arial" w:cs="Arial"/>
+          <w:b w:val="1"/>
+          <w:bCs w:val="1"/>
+          <w:noProof w:val="0"/>
+          <w:sz w:val="24"/>
+          <w:szCs w:val="24"/>
+          <w:lang w:val="es-ES"/>
+        </w:rPr>
+      </w:pPr>
+    </w:p>
+    <w:p>
+      <w:pPr>
+        <w:pStyle w:val="Normal"/>
+        <w:ind w:left="0"/>
+        <w:jc w:val="both"/>
+        <w:rPr>
+          <w:rFonts w:ascii="Arial" w:hAnsi="Arial" w:eastAsia="Arial" w:cs="Arial"/>
+          <w:b w:val="1"/>
+          <w:bCs w:val="1"/>
+          <w:noProof w:val="0"/>
+          <w:sz w:val="24"/>
+          <w:szCs w:val="24"/>
+          <w:lang w:val="es-ES"/>
+        </w:rPr>
+      </w:pPr>
+      <w:r>
+        <w:rPr>
+          <w:rFonts w:ascii="Arial" w:hAnsi="Arial" w:eastAsia="Arial" w:cs="Arial"/>
+          <w:b w:val="1"/>
+          <w:bCs w:val="1"/>
+          <w:noProof w:val="0"/>
+          <w:sz w:val="24"/>
+          <w:szCs w:val="24"/>
+          <w:lang w:val="es-ES"/>
+        </w:rPr>
+        <w:t>Conclusión</w:t>
+      </w:r>
+    </w:p>
+    <w:p>
+      <w:pPr>
+        <w:pStyle w:val="Normal"/>
+        <w:jc w:val="both"/>
+        <w:rPr>
+          <w:rFonts w:ascii="Arial" w:hAnsi="Arial" w:eastAsia="Arial" w:cs="Arial"/>
+          <w:noProof w:val="0"/>
+          <w:sz w:val="24"/>
+          <w:szCs w:val="24"/>
+          <w:lang w:val="es-ES"/>
+        </w:rPr>
+      </w:pPr>
+      <w:r>
+        <w:rPr>
+          <w:rFonts w:ascii="system-ui" w:hAnsi="system-ui" w:eastAsia="system-ui" w:cs="system-ui"/>
+          <w:b w:val="0"/>
+          <w:bCs w:val="0"/>
+          <w:i w:val="0"/>
+          <w:iCs w:val="0"/>
+          <w:caps w:val="0"/>
+          <w:smallCaps w:val="0"/>
+          <w:noProof w:val="0"/>
+          <w:color w:val="374151"/>
+          <w:sz w:val="24"/>
+          <w:szCs w:val="24"/>
+          <w:lang w:val="es-ES"/>
+        </w:rPr>
+        <w:t xml:space="preserve">La implementación del programa de formación demostró ser efectiva para mejorar las capacidades de pensamiento computacional de los estudiantes de Administración de Empresas. El aumento en su comprensión de conceptos empresariales y su mejor rendimiento académico respaldan la inclusión de esta formación en el currículo académico. El pensamiento computacional con Python y Machine </w:t>
+      </w:r>
+      <w:r>
+        <w:rPr>
+          <w:rFonts w:ascii="system-ui" w:hAnsi="system-ui" w:eastAsia="system-ui" w:cs="system-ui"/>
+          <w:b w:val="0"/>
+          <w:bCs w:val="0"/>
+          <w:i w:val="0"/>
+          <w:iCs w:val="0"/>
+          <w:caps w:val="0"/>
+          <w:smallCaps w:val="0"/>
+          <w:noProof w:val="0"/>
+          <w:color w:val="374151"/>
+          <w:sz w:val="24"/>
+          <w:szCs w:val="24"/>
+          <w:lang w:val="es-ES"/>
+        </w:rPr>
+        <w:t>Learning</w:t>
+      </w:r>
+      <w:r>
+        <w:rPr>
+          <w:rFonts w:ascii="system-ui" w:hAnsi="system-ui" w:eastAsia="system-ui" w:cs="system-ui"/>
+          <w:b w:val="0"/>
+          <w:bCs w:val="0"/>
+          <w:i w:val="0"/>
+          <w:iCs w:val="0"/>
+          <w:caps w:val="0"/>
+          <w:smallCaps w:val="0"/>
+          <w:noProof w:val="0"/>
+          <w:color w:val="374151"/>
+          <w:sz w:val="24"/>
+          <w:szCs w:val="24"/>
+          <w:lang w:val="es-ES"/>
+        </w:rPr>
+        <w:t xml:space="preserve"> es una estrategia valiosa para preparar a los futuros profesionales, equipándolos con habilidades técnicas que serán fundamentales en el entorno empresarial cada vez más digitalizado y competitivo.</w:t>
+      </w:r>
     </w:p>
     <w:p>
       <w:pPr>
@@ -718,6 +2247,1269 @@
           <w:lang w:val="es-ES"/>
         </w:rPr>
         <w:t>. " O'Reilly Media, Inc.".</w:t>
+      </w:r>
+    </w:p>
+    <w:p>
+      <w:pPr>
+        <w:spacing w:before="180" w:beforeAutospacing="off" w:after="0" w:afterAutospacing="off"/>
+      </w:pPr>
+      <w:r>
+        <w:rPr>
+          <w:rFonts w:ascii="Roboto" w:hAnsi="Roboto" w:eastAsia="Roboto" w:cs="Roboto"/>
+          <w:b w:val="0"/>
+          <w:bCs w:val="0"/>
+          <w:i w:val="0"/>
+          <w:iCs w:val="0"/>
+          <w:caps w:val="0"/>
+          <w:smallCaps w:val="0"/>
+          <w:noProof w:val="0"/>
+          <w:color w:val="111111"/>
+          <w:sz w:val="24"/>
+          <w:szCs w:val="24"/>
+          <w:lang w:val="es-ES"/>
+        </w:rPr>
+        <w:t>Cuny, J., Snyder, L., &amp; Wing, J. M. (2010). Demystifying computational thinking for non-computer scientists. Unpublished manuscript in progress. Recuperado el 30 de julio de 2023 desde</w:t>
+      </w:r>
+      <w:r>
+        <w:rPr>
+          <w:rFonts w:ascii="Roboto" w:hAnsi="Roboto" w:eastAsia="Roboto" w:cs="Roboto"/>
+          <w:b w:val="0"/>
+          <w:bCs w:val="0"/>
+          <w:i w:val="0"/>
+          <w:iCs w:val="0"/>
+          <w:caps w:val="0"/>
+          <w:smallCaps w:val="0"/>
+          <w:noProof w:val="0"/>
+          <w:color w:val="111111"/>
+          <w:sz w:val="24"/>
+          <w:szCs w:val="24"/>
+          <w:lang w:val="es-ES"/>
+        </w:rPr>
+        <w:t xml:space="preserve"> </w:t>
+      </w:r>
+      <w:hyperlink r:id="R6684cbcfaa384454">
+        <w:r>
+          <w:rPr>
+            <w:rStyle w:val="Hyperlink"/>
+            <w:rFonts w:ascii="Roboto" w:hAnsi="Roboto" w:eastAsia="Roboto" w:cs="Roboto"/>
+            <w:b w:val="0"/>
+            <w:bCs w:val="0"/>
+            <w:i w:val="0"/>
+            <w:iCs w:val="0"/>
+            <w:caps w:val="0"/>
+            <w:smallCaps w:val="0"/>
+            <w:strike w:val="0"/>
+            <w:dstrike w:val="0"/>
+            <w:noProof w:val="0"/>
+            <w:sz w:val="24"/>
+            <w:szCs w:val="24"/>
+            <w:lang w:val="es-ES"/>
+          </w:rPr>
+          <w:t>7</w:t>
+        </w:r>
+      </w:hyperlink>
+      <w:r>
+        <w:rPr>
+          <w:rFonts w:ascii="Roboto" w:hAnsi="Roboto" w:eastAsia="Roboto" w:cs="Roboto"/>
+          <w:b w:val="0"/>
+          <w:bCs w:val="0"/>
+          <w:i w:val="0"/>
+          <w:iCs w:val="0"/>
+          <w:caps w:val="0"/>
+          <w:smallCaps w:val="0"/>
+          <w:noProof w:val="0"/>
+          <w:color w:val="111111"/>
+          <w:sz w:val="24"/>
+          <w:szCs w:val="24"/>
+          <w:lang w:val="es-ES"/>
+        </w:rPr>
+        <w:t>.</w:t>
+      </w:r>
+    </w:p>
+    <w:p>
+      <w:pPr>
+        <w:spacing w:before="180" w:beforeAutospacing="off" w:after="0" w:afterAutospacing="off"/>
+      </w:pPr>
+      <w:r>
+        <w:rPr>
+          <w:rFonts w:ascii="Roboto" w:hAnsi="Roboto" w:eastAsia="Roboto" w:cs="Roboto"/>
+          <w:b w:val="0"/>
+          <w:bCs w:val="0"/>
+          <w:i w:val="0"/>
+          <w:iCs w:val="0"/>
+          <w:caps w:val="0"/>
+          <w:smallCaps w:val="0"/>
+          <w:noProof w:val="0"/>
+          <w:color w:val="111111"/>
+          <w:sz w:val="24"/>
+          <w:szCs w:val="24"/>
+          <w:lang w:val="es-ES"/>
+        </w:rPr>
+        <w:t>Rock Content (2019). Pensamiento computacional: ¿qué es y cómo desarrollarlo? Recuperado el 30 de julio de 2023 desde</w:t>
+      </w:r>
+      <w:r>
+        <w:rPr>
+          <w:rFonts w:ascii="Roboto" w:hAnsi="Roboto" w:eastAsia="Roboto" w:cs="Roboto"/>
+          <w:b w:val="0"/>
+          <w:bCs w:val="0"/>
+          <w:i w:val="0"/>
+          <w:iCs w:val="0"/>
+          <w:caps w:val="0"/>
+          <w:smallCaps w:val="0"/>
+          <w:noProof w:val="0"/>
+          <w:color w:val="111111"/>
+          <w:sz w:val="24"/>
+          <w:szCs w:val="24"/>
+          <w:lang w:val="es-ES"/>
+        </w:rPr>
+        <w:t xml:space="preserve"> </w:t>
+      </w:r>
+      <w:hyperlink r:id="R25f1e7ac7b3e4c3b">
+        <w:r>
+          <w:rPr>
+            <w:rStyle w:val="Hyperlink"/>
+            <w:rFonts w:ascii="Roboto" w:hAnsi="Roboto" w:eastAsia="Roboto" w:cs="Roboto"/>
+            <w:b w:val="0"/>
+            <w:bCs w:val="0"/>
+            <w:i w:val="0"/>
+            <w:iCs w:val="0"/>
+            <w:caps w:val="0"/>
+            <w:smallCaps w:val="0"/>
+            <w:strike w:val="0"/>
+            <w:dstrike w:val="0"/>
+            <w:noProof w:val="0"/>
+            <w:sz w:val="24"/>
+            <w:szCs w:val="24"/>
+            <w:lang w:val="es-ES"/>
+          </w:rPr>
+          <w:t>8</w:t>
+        </w:r>
+      </w:hyperlink>
+      <w:r>
+        <w:rPr>
+          <w:rFonts w:ascii="Roboto" w:hAnsi="Roboto" w:eastAsia="Roboto" w:cs="Roboto"/>
+          <w:b w:val="0"/>
+          <w:bCs w:val="0"/>
+          <w:i w:val="0"/>
+          <w:iCs w:val="0"/>
+          <w:caps w:val="0"/>
+          <w:smallCaps w:val="0"/>
+          <w:noProof w:val="0"/>
+          <w:color w:val="111111"/>
+          <w:sz w:val="24"/>
+          <w:szCs w:val="24"/>
+          <w:lang w:val="es-ES"/>
+        </w:rPr>
+        <w:t>.</w:t>
+      </w:r>
+    </w:p>
+    <w:p>
+      <w:pPr>
+        <w:spacing w:before="180" w:beforeAutospacing="off" w:after="0" w:afterAutospacing="off"/>
+      </w:pPr>
+      <w:r>
+        <w:rPr>
+          <w:rFonts w:ascii="Roboto" w:hAnsi="Roboto" w:eastAsia="Roboto" w:cs="Roboto"/>
+          <w:b w:val="0"/>
+          <w:bCs w:val="0"/>
+          <w:i w:val="0"/>
+          <w:iCs w:val="0"/>
+          <w:caps w:val="0"/>
+          <w:smallCaps w:val="0"/>
+          <w:noProof w:val="0"/>
+          <w:color w:val="111111"/>
+          <w:sz w:val="24"/>
+          <w:szCs w:val="24"/>
+          <w:lang w:val="es-ES"/>
+        </w:rPr>
+        <w:t>Icesi (s.f.). Pensamiento Computacional (PC) en educación escolar. Recuperado el 30 de julio de 2023 desde</w:t>
+      </w:r>
+      <w:r>
+        <w:rPr>
+          <w:rFonts w:ascii="Roboto" w:hAnsi="Roboto" w:eastAsia="Roboto" w:cs="Roboto"/>
+          <w:b w:val="0"/>
+          <w:bCs w:val="0"/>
+          <w:i w:val="0"/>
+          <w:iCs w:val="0"/>
+          <w:caps w:val="0"/>
+          <w:smallCaps w:val="0"/>
+          <w:noProof w:val="0"/>
+          <w:color w:val="111111"/>
+          <w:sz w:val="24"/>
+          <w:szCs w:val="24"/>
+          <w:lang w:val="es-ES"/>
+        </w:rPr>
+        <w:t xml:space="preserve"> </w:t>
+      </w:r>
+      <w:hyperlink r:id="Ra11b6bcf739e43d2">
+        <w:r>
+          <w:rPr>
+            <w:rStyle w:val="Hyperlink"/>
+            <w:rFonts w:ascii="Roboto" w:hAnsi="Roboto" w:eastAsia="Roboto" w:cs="Roboto"/>
+            <w:b w:val="0"/>
+            <w:bCs w:val="0"/>
+            <w:i w:val="0"/>
+            <w:iCs w:val="0"/>
+            <w:caps w:val="0"/>
+            <w:smallCaps w:val="0"/>
+            <w:strike w:val="0"/>
+            <w:dstrike w:val="0"/>
+            <w:noProof w:val="0"/>
+            <w:sz w:val="24"/>
+            <w:szCs w:val="24"/>
+            <w:lang w:val="es-ES"/>
+          </w:rPr>
+          <w:t>9</w:t>
+        </w:r>
+      </w:hyperlink>
+      <w:r>
+        <w:rPr>
+          <w:rFonts w:ascii="Roboto" w:hAnsi="Roboto" w:eastAsia="Roboto" w:cs="Roboto"/>
+          <w:b w:val="0"/>
+          <w:bCs w:val="0"/>
+          <w:i w:val="0"/>
+          <w:iCs w:val="0"/>
+          <w:caps w:val="0"/>
+          <w:smallCaps w:val="0"/>
+          <w:noProof w:val="0"/>
+          <w:color w:val="111111"/>
+          <w:sz w:val="24"/>
+          <w:szCs w:val="24"/>
+          <w:lang w:val="es-ES"/>
+        </w:rPr>
+        <w:t>.</w:t>
+      </w:r>
+    </w:p>
+    <w:p>
+      <w:pPr>
+        <w:pStyle w:val="Normal"/>
+        <w:spacing w:before="0" w:beforeAutospacing="off" w:after="0" w:afterAutospacing="off"/>
+        <w:ind w:left="0"/>
+        <w:rPr>
+          <w:rFonts w:ascii="Calibri" w:hAnsi="Calibri" w:eastAsia="Calibri" w:cs="Calibri"/>
+          <w:b w:val="0"/>
+          <w:bCs w:val="0"/>
+          <w:i w:val="0"/>
+          <w:iCs w:val="0"/>
+          <w:caps w:val="0"/>
+          <w:smallCaps w:val="0"/>
+          <w:noProof w:val="0"/>
+          <w:color w:val="1F1F1F"/>
+          <w:sz w:val="24"/>
+          <w:szCs w:val="24"/>
+          <w:lang w:val="es-ES"/>
+        </w:rPr>
+      </w:pPr>
+      <w:r>
+        <w:rPr>
+          <w:rFonts w:ascii="Calibri" w:hAnsi="Calibri" w:eastAsia="Calibri" w:cs="Calibri"/>
+          <w:b w:val="0"/>
+          <w:bCs w:val="0"/>
+          <w:i w:val="0"/>
+          <w:iCs w:val="0"/>
+          <w:caps w:val="0"/>
+          <w:smallCaps w:val="0"/>
+          <w:noProof w:val="0"/>
+          <w:color w:val="1F1F1F"/>
+          <w:sz w:val="24"/>
+          <w:szCs w:val="24"/>
+          <w:lang w:val="es-ES"/>
+        </w:rPr>
+        <w:t xml:space="preserve">Barr, V., &amp; Stephenson, C. (2011). </w:t>
+      </w:r>
+      <w:r>
+        <w:rPr>
+          <w:rFonts w:ascii="Calibri" w:hAnsi="Calibri" w:eastAsia="Calibri" w:cs="Calibri"/>
+          <w:b w:val="0"/>
+          <w:bCs w:val="0"/>
+          <w:i w:val="0"/>
+          <w:iCs w:val="0"/>
+          <w:caps w:val="0"/>
+          <w:smallCaps w:val="0"/>
+          <w:noProof w:val="0"/>
+          <w:color w:val="1F1F1F"/>
+          <w:sz w:val="24"/>
+          <w:szCs w:val="24"/>
+          <w:lang w:val="es-ES"/>
+        </w:rPr>
+        <w:t>Bringing</w:t>
+      </w:r>
+      <w:r>
+        <w:rPr>
+          <w:rFonts w:ascii="Calibri" w:hAnsi="Calibri" w:eastAsia="Calibri" w:cs="Calibri"/>
+          <w:b w:val="0"/>
+          <w:bCs w:val="0"/>
+          <w:i w:val="0"/>
+          <w:iCs w:val="0"/>
+          <w:caps w:val="0"/>
+          <w:smallCaps w:val="0"/>
+          <w:noProof w:val="0"/>
+          <w:color w:val="1F1F1F"/>
+          <w:sz w:val="24"/>
+          <w:szCs w:val="24"/>
+          <w:lang w:val="es-ES"/>
+        </w:rPr>
+        <w:t xml:space="preserve"> </w:t>
+      </w:r>
+      <w:r>
+        <w:rPr>
+          <w:rFonts w:ascii="Calibri" w:hAnsi="Calibri" w:eastAsia="Calibri" w:cs="Calibri"/>
+          <w:b w:val="0"/>
+          <w:bCs w:val="0"/>
+          <w:i w:val="0"/>
+          <w:iCs w:val="0"/>
+          <w:caps w:val="0"/>
+          <w:smallCaps w:val="0"/>
+          <w:noProof w:val="0"/>
+          <w:color w:val="1F1F1F"/>
+          <w:sz w:val="24"/>
+          <w:szCs w:val="24"/>
+          <w:lang w:val="es-ES"/>
+        </w:rPr>
+        <w:t>computational</w:t>
+      </w:r>
+      <w:r>
+        <w:rPr>
+          <w:rFonts w:ascii="Calibri" w:hAnsi="Calibri" w:eastAsia="Calibri" w:cs="Calibri"/>
+          <w:b w:val="0"/>
+          <w:bCs w:val="0"/>
+          <w:i w:val="0"/>
+          <w:iCs w:val="0"/>
+          <w:caps w:val="0"/>
+          <w:smallCaps w:val="0"/>
+          <w:noProof w:val="0"/>
+          <w:color w:val="1F1F1F"/>
+          <w:sz w:val="24"/>
+          <w:szCs w:val="24"/>
+          <w:lang w:val="es-ES"/>
+        </w:rPr>
+        <w:t xml:space="preserve"> </w:t>
+      </w:r>
+      <w:r>
+        <w:rPr>
+          <w:rFonts w:ascii="Calibri" w:hAnsi="Calibri" w:eastAsia="Calibri" w:cs="Calibri"/>
+          <w:b w:val="0"/>
+          <w:bCs w:val="0"/>
+          <w:i w:val="0"/>
+          <w:iCs w:val="0"/>
+          <w:caps w:val="0"/>
+          <w:smallCaps w:val="0"/>
+          <w:noProof w:val="0"/>
+          <w:color w:val="1F1F1F"/>
+          <w:sz w:val="24"/>
+          <w:szCs w:val="24"/>
+          <w:lang w:val="es-ES"/>
+        </w:rPr>
+        <w:t>thinking</w:t>
+      </w:r>
+      <w:r>
+        <w:rPr>
+          <w:rFonts w:ascii="Calibri" w:hAnsi="Calibri" w:eastAsia="Calibri" w:cs="Calibri"/>
+          <w:b w:val="0"/>
+          <w:bCs w:val="0"/>
+          <w:i w:val="0"/>
+          <w:iCs w:val="0"/>
+          <w:caps w:val="0"/>
+          <w:smallCaps w:val="0"/>
+          <w:noProof w:val="0"/>
+          <w:color w:val="1F1F1F"/>
+          <w:sz w:val="24"/>
+          <w:szCs w:val="24"/>
+          <w:lang w:val="es-ES"/>
+        </w:rPr>
+        <w:t xml:space="preserve"> </w:t>
+      </w:r>
+      <w:r>
+        <w:rPr>
+          <w:rFonts w:ascii="Calibri" w:hAnsi="Calibri" w:eastAsia="Calibri" w:cs="Calibri"/>
+          <w:b w:val="0"/>
+          <w:bCs w:val="0"/>
+          <w:i w:val="0"/>
+          <w:iCs w:val="0"/>
+          <w:caps w:val="0"/>
+          <w:smallCaps w:val="0"/>
+          <w:noProof w:val="0"/>
+          <w:color w:val="1F1F1F"/>
+          <w:sz w:val="24"/>
+          <w:szCs w:val="24"/>
+          <w:lang w:val="es-ES"/>
+        </w:rPr>
+        <w:t>to</w:t>
+      </w:r>
+      <w:r>
+        <w:rPr>
+          <w:rFonts w:ascii="Calibri" w:hAnsi="Calibri" w:eastAsia="Calibri" w:cs="Calibri"/>
+          <w:b w:val="0"/>
+          <w:bCs w:val="0"/>
+          <w:i w:val="0"/>
+          <w:iCs w:val="0"/>
+          <w:caps w:val="0"/>
+          <w:smallCaps w:val="0"/>
+          <w:noProof w:val="0"/>
+          <w:color w:val="1F1F1F"/>
+          <w:sz w:val="24"/>
+          <w:szCs w:val="24"/>
+          <w:lang w:val="es-ES"/>
+        </w:rPr>
+        <w:t xml:space="preserve"> K-12: A </w:t>
+      </w:r>
+      <w:r>
+        <w:rPr>
+          <w:rFonts w:ascii="Calibri" w:hAnsi="Calibri" w:eastAsia="Calibri" w:cs="Calibri"/>
+          <w:b w:val="0"/>
+          <w:bCs w:val="0"/>
+          <w:i w:val="0"/>
+          <w:iCs w:val="0"/>
+          <w:caps w:val="0"/>
+          <w:smallCaps w:val="0"/>
+          <w:noProof w:val="0"/>
+          <w:color w:val="1F1F1F"/>
+          <w:sz w:val="24"/>
+          <w:szCs w:val="24"/>
+          <w:lang w:val="es-ES"/>
+        </w:rPr>
+        <w:t>report</w:t>
+      </w:r>
+      <w:r>
+        <w:rPr>
+          <w:rFonts w:ascii="Calibri" w:hAnsi="Calibri" w:eastAsia="Calibri" w:cs="Calibri"/>
+          <w:b w:val="0"/>
+          <w:bCs w:val="0"/>
+          <w:i w:val="0"/>
+          <w:iCs w:val="0"/>
+          <w:caps w:val="0"/>
+          <w:smallCaps w:val="0"/>
+          <w:noProof w:val="0"/>
+          <w:color w:val="1F1F1F"/>
+          <w:sz w:val="24"/>
+          <w:szCs w:val="24"/>
+          <w:lang w:val="es-ES"/>
+        </w:rPr>
+        <w:t xml:space="preserve"> </w:t>
+      </w:r>
+      <w:r>
+        <w:rPr>
+          <w:rFonts w:ascii="Calibri" w:hAnsi="Calibri" w:eastAsia="Calibri" w:cs="Calibri"/>
+          <w:b w:val="0"/>
+          <w:bCs w:val="0"/>
+          <w:i w:val="0"/>
+          <w:iCs w:val="0"/>
+          <w:caps w:val="0"/>
+          <w:smallCaps w:val="0"/>
+          <w:noProof w:val="0"/>
+          <w:color w:val="1F1F1F"/>
+          <w:sz w:val="24"/>
+          <w:szCs w:val="24"/>
+          <w:lang w:val="es-ES"/>
+        </w:rPr>
+        <w:t>of</w:t>
+      </w:r>
+      <w:r>
+        <w:rPr>
+          <w:rFonts w:ascii="Calibri" w:hAnsi="Calibri" w:eastAsia="Calibri" w:cs="Calibri"/>
+          <w:b w:val="0"/>
+          <w:bCs w:val="0"/>
+          <w:i w:val="0"/>
+          <w:iCs w:val="0"/>
+          <w:caps w:val="0"/>
+          <w:smallCaps w:val="0"/>
+          <w:noProof w:val="0"/>
+          <w:color w:val="1F1F1F"/>
+          <w:sz w:val="24"/>
+          <w:szCs w:val="24"/>
+          <w:lang w:val="es-ES"/>
+        </w:rPr>
+        <w:t xml:space="preserve"> </w:t>
+      </w:r>
+      <w:r>
+        <w:rPr>
+          <w:rFonts w:ascii="Calibri" w:hAnsi="Calibri" w:eastAsia="Calibri" w:cs="Calibri"/>
+          <w:b w:val="0"/>
+          <w:bCs w:val="0"/>
+          <w:i w:val="0"/>
+          <w:iCs w:val="0"/>
+          <w:caps w:val="0"/>
+          <w:smallCaps w:val="0"/>
+          <w:noProof w:val="0"/>
+          <w:color w:val="1F1F1F"/>
+          <w:sz w:val="24"/>
+          <w:szCs w:val="24"/>
+          <w:lang w:val="es-ES"/>
+        </w:rPr>
+        <w:t>the</w:t>
+      </w:r>
+      <w:r>
+        <w:rPr>
+          <w:rFonts w:ascii="Calibri" w:hAnsi="Calibri" w:eastAsia="Calibri" w:cs="Calibri"/>
+          <w:b w:val="0"/>
+          <w:bCs w:val="0"/>
+          <w:i w:val="0"/>
+          <w:iCs w:val="0"/>
+          <w:caps w:val="0"/>
+          <w:smallCaps w:val="0"/>
+          <w:noProof w:val="0"/>
+          <w:color w:val="1F1F1F"/>
+          <w:sz w:val="24"/>
+          <w:szCs w:val="24"/>
+          <w:lang w:val="es-ES"/>
+        </w:rPr>
+        <w:t xml:space="preserve"> </w:t>
+      </w:r>
+      <w:r>
+        <w:rPr>
+          <w:rFonts w:ascii="Calibri" w:hAnsi="Calibri" w:eastAsia="Calibri" w:cs="Calibri"/>
+          <w:b w:val="0"/>
+          <w:bCs w:val="0"/>
+          <w:i w:val="0"/>
+          <w:iCs w:val="0"/>
+          <w:caps w:val="0"/>
+          <w:smallCaps w:val="0"/>
+          <w:noProof w:val="0"/>
+          <w:color w:val="1F1F1F"/>
+          <w:sz w:val="24"/>
+          <w:szCs w:val="24"/>
+          <w:lang w:val="es-ES"/>
+        </w:rPr>
+        <w:t>working</w:t>
+      </w:r>
+      <w:r>
+        <w:rPr>
+          <w:rFonts w:ascii="Calibri" w:hAnsi="Calibri" w:eastAsia="Calibri" w:cs="Calibri"/>
+          <w:b w:val="0"/>
+          <w:bCs w:val="0"/>
+          <w:i w:val="0"/>
+          <w:iCs w:val="0"/>
+          <w:caps w:val="0"/>
+          <w:smallCaps w:val="0"/>
+          <w:noProof w:val="0"/>
+          <w:color w:val="1F1F1F"/>
+          <w:sz w:val="24"/>
+          <w:szCs w:val="24"/>
+          <w:lang w:val="es-ES"/>
+        </w:rPr>
+        <w:t xml:space="preserve"> </w:t>
+      </w:r>
+      <w:r>
+        <w:rPr>
+          <w:rFonts w:ascii="Calibri" w:hAnsi="Calibri" w:eastAsia="Calibri" w:cs="Calibri"/>
+          <w:b w:val="0"/>
+          <w:bCs w:val="0"/>
+          <w:i w:val="0"/>
+          <w:iCs w:val="0"/>
+          <w:caps w:val="0"/>
+          <w:smallCaps w:val="0"/>
+          <w:noProof w:val="0"/>
+          <w:color w:val="1F1F1F"/>
+          <w:sz w:val="24"/>
+          <w:szCs w:val="24"/>
+          <w:lang w:val="es-ES"/>
+        </w:rPr>
+        <w:t>group</w:t>
+      </w:r>
+      <w:r>
+        <w:rPr>
+          <w:rFonts w:ascii="Calibri" w:hAnsi="Calibri" w:eastAsia="Calibri" w:cs="Calibri"/>
+          <w:b w:val="0"/>
+          <w:bCs w:val="0"/>
+          <w:i w:val="0"/>
+          <w:iCs w:val="0"/>
+          <w:caps w:val="0"/>
+          <w:smallCaps w:val="0"/>
+          <w:noProof w:val="0"/>
+          <w:color w:val="1F1F1F"/>
+          <w:sz w:val="24"/>
+          <w:szCs w:val="24"/>
+          <w:lang w:val="es-ES"/>
+        </w:rPr>
+        <w:t xml:space="preserve"> </w:t>
+      </w:r>
+      <w:r>
+        <w:rPr>
+          <w:rFonts w:ascii="Calibri" w:hAnsi="Calibri" w:eastAsia="Calibri" w:cs="Calibri"/>
+          <w:b w:val="0"/>
+          <w:bCs w:val="0"/>
+          <w:i w:val="0"/>
+          <w:iCs w:val="0"/>
+          <w:caps w:val="0"/>
+          <w:smallCaps w:val="0"/>
+          <w:noProof w:val="0"/>
+          <w:color w:val="1F1F1F"/>
+          <w:sz w:val="24"/>
+          <w:szCs w:val="24"/>
+          <w:lang w:val="es-ES"/>
+        </w:rPr>
+        <w:t>on</w:t>
+      </w:r>
+      <w:r>
+        <w:rPr>
+          <w:rFonts w:ascii="Calibri" w:hAnsi="Calibri" w:eastAsia="Calibri" w:cs="Calibri"/>
+          <w:b w:val="0"/>
+          <w:bCs w:val="0"/>
+          <w:i w:val="0"/>
+          <w:iCs w:val="0"/>
+          <w:caps w:val="0"/>
+          <w:smallCaps w:val="0"/>
+          <w:noProof w:val="0"/>
+          <w:color w:val="1F1F1F"/>
+          <w:sz w:val="24"/>
+          <w:szCs w:val="24"/>
+          <w:lang w:val="es-ES"/>
+        </w:rPr>
+        <w:t xml:space="preserve"> </w:t>
+      </w:r>
+      <w:r>
+        <w:rPr>
+          <w:rFonts w:ascii="Calibri" w:hAnsi="Calibri" w:eastAsia="Calibri" w:cs="Calibri"/>
+          <w:b w:val="0"/>
+          <w:bCs w:val="0"/>
+          <w:i w:val="0"/>
+          <w:iCs w:val="0"/>
+          <w:caps w:val="0"/>
+          <w:smallCaps w:val="0"/>
+          <w:noProof w:val="0"/>
+          <w:color w:val="1F1F1F"/>
+          <w:sz w:val="24"/>
+          <w:szCs w:val="24"/>
+          <w:lang w:val="es-ES"/>
+        </w:rPr>
+        <w:t>computational</w:t>
+      </w:r>
+      <w:r>
+        <w:rPr>
+          <w:rFonts w:ascii="Calibri" w:hAnsi="Calibri" w:eastAsia="Calibri" w:cs="Calibri"/>
+          <w:b w:val="0"/>
+          <w:bCs w:val="0"/>
+          <w:i w:val="0"/>
+          <w:iCs w:val="0"/>
+          <w:caps w:val="0"/>
+          <w:smallCaps w:val="0"/>
+          <w:noProof w:val="0"/>
+          <w:color w:val="1F1F1F"/>
+          <w:sz w:val="24"/>
+          <w:szCs w:val="24"/>
+          <w:lang w:val="es-ES"/>
+        </w:rPr>
+        <w:t xml:space="preserve"> </w:t>
+      </w:r>
+      <w:r>
+        <w:rPr>
+          <w:rFonts w:ascii="Calibri" w:hAnsi="Calibri" w:eastAsia="Calibri" w:cs="Calibri"/>
+          <w:b w:val="0"/>
+          <w:bCs w:val="0"/>
+          <w:i w:val="0"/>
+          <w:iCs w:val="0"/>
+          <w:caps w:val="0"/>
+          <w:smallCaps w:val="0"/>
+          <w:noProof w:val="0"/>
+          <w:color w:val="1F1F1F"/>
+          <w:sz w:val="24"/>
+          <w:szCs w:val="24"/>
+          <w:lang w:val="es-ES"/>
+        </w:rPr>
+        <w:t>thinking</w:t>
+      </w:r>
+      <w:r>
+        <w:rPr>
+          <w:rFonts w:ascii="Calibri" w:hAnsi="Calibri" w:eastAsia="Calibri" w:cs="Calibri"/>
+          <w:b w:val="0"/>
+          <w:bCs w:val="0"/>
+          <w:i w:val="0"/>
+          <w:iCs w:val="0"/>
+          <w:caps w:val="0"/>
+          <w:smallCaps w:val="0"/>
+          <w:noProof w:val="0"/>
+          <w:color w:val="1F1F1F"/>
+          <w:sz w:val="24"/>
+          <w:szCs w:val="24"/>
+          <w:lang w:val="es-ES"/>
+        </w:rPr>
+        <w:t xml:space="preserve"> </w:t>
+      </w:r>
+      <w:r>
+        <w:rPr>
+          <w:rFonts w:ascii="Calibri" w:hAnsi="Calibri" w:eastAsia="Calibri" w:cs="Calibri"/>
+          <w:b w:val="0"/>
+          <w:bCs w:val="0"/>
+          <w:i w:val="0"/>
+          <w:iCs w:val="0"/>
+          <w:caps w:val="0"/>
+          <w:smallCaps w:val="0"/>
+          <w:noProof w:val="0"/>
+          <w:color w:val="1F1F1F"/>
+          <w:sz w:val="24"/>
+          <w:szCs w:val="24"/>
+          <w:lang w:val="es-ES"/>
+        </w:rPr>
+        <w:t>for</w:t>
+      </w:r>
+      <w:r>
+        <w:rPr>
+          <w:rFonts w:ascii="Calibri" w:hAnsi="Calibri" w:eastAsia="Calibri" w:cs="Calibri"/>
+          <w:b w:val="0"/>
+          <w:bCs w:val="0"/>
+          <w:i w:val="0"/>
+          <w:iCs w:val="0"/>
+          <w:caps w:val="0"/>
+          <w:smallCaps w:val="0"/>
+          <w:noProof w:val="0"/>
+          <w:color w:val="1F1F1F"/>
+          <w:sz w:val="24"/>
+          <w:szCs w:val="24"/>
+          <w:lang w:val="es-ES"/>
+        </w:rPr>
+        <w:t xml:space="preserve"> </w:t>
+      </w:r>
+      <w:r>
+        <w:rPr>
+          <w:rFonts w:ascii="Calibri" w:hAnsi="Calibri" w:eastAsia="Calibri" w:cs="Calibri"/>
+          <w:b w:val="0"/>
+          <w:bCs w:val="0"/>
+          <w:i w:val="0"/>
+          <w:iCs w:val="0"/>
+          <w:caps w:val="0"/>
+          <w:smallCaps w:val="0"/>
+          <w:noProof w:val="0"/>
+          <w:color w:val="1F1F1F"/>
+          <w:sz w:val="24"/>
+          <w:szCs w:val="24"/>
+          <w:lang w:val="es-ES"/>
+        </w:rPr>
+        <w:t>the</w:t>
+      </w:r>
+      <w:r>
+        <w:rPr>
+          <w:rFonts w:ascii="Calibri" w:hAnsi="Calibri" w:eastAsia="Calibri" w:cs="Calibri"/>
+          <w:b w:val="0"/>
+          <w:bCs w:val="0"/>
+          <w:i w:val="0"/>
+          <w:iCs w:val="0"/>
+          <w:caps w:val="0"/>
+          <w:smallCaps w:val="0"/>
+          <w:noProof w:val="0"/>
+          <w:color w:val="1F1F1F"/>
+          <w:sz w:val="24"/>
+          <w:szCs w:val="24"/>
+          <w:lang w:val="es-ES"/>
+        </w:rPr>
+        <w:t xml:space="preserve"> </w:t>
+      </w:r>
+      <w:r>
+        <w:rPr>
+          <w:rFonts w:ascii="Calibri" w:hAnsi="Calibri" w:eastAsia="Calibri" w:cs="Calibri"/>
+          <w:b w:val="0"/>
+          <w:bCs w:val="0"/>
+          <w:i w:val="0"/>
+          <w:iCs w:val="0"/>
+          <w:caps w:val="0"/>
+          <w:smallCaps w:val="0"/>
+          <w:noProof w:val="0"/>
+          <w:color w:val="1F1F1F"/>
+          <w:sz w:val="24"/>
+          <w:szCs w:val="24"/>
+          <w:lang w:val="es-ES"/>
+        </w:rPr>
+        <w:t>committee</w:t>
+      </w:r>
+      <w:r>
+        <w:rPr>
+          <w:rFonts w:ascii="Calibri" w:hAnsi="Calibri" w:eastAsia="Calibri" w:cs="Calibri"/>
+          <w:b w:val="0"/>
+          <w:bCs w:val="0"/>
+          <w:i w:val="0"/>
+          <w:iCs w:val="0"/>
+          <w:caps w:val="0"/>
+          <w:smallCaps w:val="0"/>
+          <w:noProof w:val="0"/>
+          <w:color w:val="1F1F1F"/>
+          <w:sz w:val="24"/>
+          <w:szCs w:val="24"/>
+          <w:lang w:val="es-ES"/>
+        </w:rPr>
+        <w:t xml:space="preserve"> </w:t>
+      </w:r>
+      <w:r>
+        <w:rPr>
+          <w:rFonts w:ascii="Calibri" w:hAnsi="Calibri" w:eastAsia="Calibri" w:cs="Calibri"/>
+          <w:b w:val="0"/>
+          <w:bCs w:val="0"/>
+          <w:i w:val="0"/>
+          <w:iCs w:val="0"/>
+          <w:caps w:val="0"/>
+          <w:smallCaps w:val="0"/>
+          <w:noProof w:val="0"/>
+          <w:color w:val="1F1F1F"/>
+          <w:sz w:val="24"/>
+          <w:szCs w:val="24"/>
+          <w:lang w:val="es-ES"/>
+        </w:rPr>
+        <w:t>on</w:t>
+      </w:r>
+      <w:r>
+        <w:rPr>
+          <w:rFonts w:ascii="Calibri" w:hAnsi="Calibri" w:eastAsia="Calibri" w:cs="Calibri"/>
+          <w:b w:val="0"/>
+          <w:bCs w:val="0"/>
+          <w:i w:val="0"/>
+          <w:iCs w:val="0"/>
+          <w:caps w:val="0"/>
+          <w:smallCaps w:val="0"/>
+          <w:noProof w:val="0"/>
+          <w:color w:val="1F1F1F"/>
+          <w:sz w:val="24"/>
+          <w:szCs w:val="24"/>
+          <w:lang w:val="es-ES"/>
+        </w:rPr>
+        <w:t xml:space="preserve"> </w:t>
+      </w:r>
+      <w:r>
+        <w:rPr>
+          <w:rFonts w:ascii="Calibri" w:hAnsi="Calibri" w:eastAsia="Calibri" w:cs="Calibri"/>
+          <w:b w:val="0"/>
+          <w:bCs w:val="0"/>
+          <w:i w:val="0"/>
+          <w:iCs w:val="0"/>
+          <w:caps w:val="0"/>
+          <w:smallCaps w:val="0"/>
+          <w:noProof w:val="0"/>
+          <w:color w:val="1F1F1F"/>
+          <w:sz w:val="24"/>
+          <w:szCs w:val="24"/>
+          <w:lang w:val="es-ES"/>
+        </w:rPr>
+        <w:t>the</w:t>
+      </w:r>
+      <w:r>
+        <w:rPr>
+          <w:rFonts w:ascii="Calibri" w:hAnsi="Calibri" w:eastAsia="Calibri" w:cs="Calibri"/>
+          <w:b w:val="0"/>
+          <w:bCs w:val="0"/>
+          <w:i w:val="0"/>
+          <w:iCs w:val="0"/>
+          <w:caps w:val="0"/>
+          <w:smallCaps w:val="0"/>
+          <w:noProof w:val="0"/>
+          <w:color w:val="1F1F1F"/>
+          <w:sz w:val="24"/>
+          <w:szCs w:val="24"/>
+          <w:lang w:val="es-ES"/>
+        </w:rPr>
+        <w:t xml:space="preserve"> future </w:t>
+      </w:r>
+      <w:r>
+        <w:rPr>
+          <w:rFonts w:ascii="Calibri" w:hAnsi="Calibri" w:eastAsia="Calibri" w:cs="Calibri"/>
+          <w:b w:val="0"/>
+          <w:bCs w:val="0"/>
+          <w:i w:val="0"/>
+          <w:iCs w:val="0"/>
+          <w:caps w:val="0"/>
+          <w:smallCaps w:val="0"/>
+          <w:noProof w:val="0"/>
+          <w:color w:val="1F1F1F"/>
+          <w:sz w:val="24"/>
+          <w:szCs w:val="24"/>
+          <w:lang w:val="es-ES"/>
+        </w:rPr>
+        <w:t>of</w:t>
+      </w:r>
+      <w:r>
+        <w:rPr>
+          <w:rFonts w:ascii="Calibri" w:hAnsi="Calibri" w:eastAsia="Calibri" w:cs="Calibri"/>
+          <w:b w:val="0"/>
+          <w:bCs w:val="0"/>
+          <w:i w:val="0"/>
+          <w:iCs w:val="0"/>
+          <w:caps w:val="0"/>
+          <w:smallCaps w:val="0"/>
+          <w:noProof w:val="0"/>
+          <w:color w:val="1F1F1F"/>
+          <w:sz w:val="24"/>
+          <w:szCs w:val="24"/>
+          <w:lang w:val="es-ES"/>
+        </w:rPr>
+        <w:t xml:space="preserve"> </w:t>
+      </w:r>
+      <w:r>
+        <w:rPr>
+          <w:rFonts w:ascii="Calibri" w:hAnsi="Calibri" w:eastAsia="Calibri" w:cs="Calibri"/>
+          <w:b w:val="0"/>
+          <w:bCs w:val="0"/>
+          <w:i w:val="0"/>
+          <w:iCs w:val="0"/>
+          <w:caps w:val="0"/>
+          <w:smallCaps w:val="0"/>
+          <w:noProof w:val="0"/>
+          <w:color w:val="1F1F1F"/>
+          <w:sz w:val="24"/>
+          <w:szCs w:val="24"/>
+          <w:lang w:val="es-ES"/>
+        </w:rPr>
+        <w:t>learning</w:t>
+      </w:r>
+      <w:r>
+        <w:rPr>
+          <w:rFonts w:ascii="Calibri" w:hAnsi="Calibri" w:eastAsia="Calibri" w:cs="Calibri"/>
+          <w:b w:val="0"/>
+          <w:bCs w:val="0"/>
+          <w:i w:val="0"/>
+          <w:iCs w:val="0"/>
+          <w:caps w:val="0"/>
+          <w:smallCaps w:val="0"/>
+          <w:noProof w:val="0"/>
+          <w:color w:val="1F1F1F"/>
+          <w:sz w:val="24"/>
+          <w:szCs w:val="24"/>
+          <w:lang w:val="es-ES"/>
+        </w:rPr>
+        <w:t xml:space="preserve">. Washington, DC: </w:t>
+      </w:r>
+      <w:r>
+        <w:rPr>
+          <w:rFonts w:ascii="Calibri" w:hAnsi="Calibri" w:eastAsia="Calibri" w:cs="Calibri"/>
+          <w:b w:val="0"/>
+          <w:bCs w:val="0"/>
+          <w:i w:val="0"/>
+          <w:iCs w:val="0"/>
+          <w:caps w:val="0"/>
+          <w:smallCaps w:val="0"/>
+          <w:noProof w:val="0"/>
+          <w:color w:val="1F1F1F"/>
+          <w:sz w:val="24"/>
+          <w:szCs w:val="24"/>
+          <w:lang w:val="es-ES"/>
+        </w:rPr>
+        <w:t>National</w:t>
+      </w:r>
+      <w:r>
+        <w:rPr>
+          <w:rFonts w:ascii="Calibri" w:hAnsi="Calibri" w:eastAsia="Calibri" w:cs="Calibri"/>
+          <w:b w:val="0"/>
+          <w:bCs w:val="0"/>
+          <w:i w:val="0"/>
+          <w:iCs w:val="0"/>
+          <w:caps w:val="0"/>
+          <w:smallCaps w:val="0"/>
+          <w:noProof w:val="0"/>
+          <w:color w:val="1F1F1F"/>
+          <w:sz w:val="24"/>
+          <w:szCs w:val="24"/>
+          <w:lang w:val="es-ES"/>
+        </w:rPr>
+        <w:t xml:space="preserve"> </w:t>
+      </w:r>
+      <w:r>
+        <w:rPr>
+          <w:rFonts w:ascii="Calibri" w:hAnsi="Calibri" w:eastAsia="Calibri" w:cs="Calibri"/>
+          <w:b w:val="0"/>
+          <w:bCs w:val="0"/>
+          <w:i w:val="0"/>
+          <w:iCs w:val="0"/>
+          <w:caps w:val="0"/>
+          <w:smallCaps w:val="0"/>
+          <w:noProof w:val="0"/>
+          <w:color w:val="1F1F1F"/>
+          <w:sz w:val="24"/>
+          <w:szCs w:val="24"/>
+          <w:lang w:val="es-ES"/>
+        </w:rPr>
+        <w:t>Academies</w:t>
+      </w:r>
+      <w:r>
+        <w:rPr>
+          <w:rFonts w:ascii="Calibri" w:hAnsi="Calibri" w:eastAsia="Calibri" w:cs="Calibri"/>
+          <w:b w:val="0"/>
+          <w:bCs w:val="0"/>
+          <w:i w:val="0"/>
+          <w:iCs w:val="0"/>
+          <w:caps w:val="0"/>
+          <w:smallCaps w:val="0"/>
+          <w:noProof w:val="0"/>
+          <w:color w:val="1F1F1F"/>
+          <w:sz w:val="24"/>
+          <w:szCs w:val="24"/>
+          <w:lang w:val="es-ES"/>
+        </w:rPr>
+        <w:t xml:space="preserve"> </w:t>
+      </w:r>
+      <w:r>
+        <w:rPr>
+          <w:rFonts w:ascii="Calibri" w:hAnsi="Calibri" w:eastAsia="Calibri" w:cs="Calibri"/>
+          <w:b w:val="0"/>
+          <w:bCs w:val="0"/>
+          <w:i w:val="0"/>
+          <w:iCs w:val="0"/>
+          <w:caps w:val="0"/>
+          <w:smallCaps w:val="0"/>
+          <w:noProof w:val="0"/>
+          <w:color w:val="1F1F1F"/>
+          <w:sz w:val="24"/>
+          <w:szCs w:val="24"/>
+          <w:lang w:val="es-ES"/>
+        </w:rPr>
+        <w:t>Press</w:t>
+      </w:r>
+      <w:r>
+        <w:rPr>
+          <w:rFonts w:ascii="Calibri" w:hAnsi="Calibri" w:eastAsia="Calibri" w:cs="Calibri"/>
+          <w:b w:val="0"/>
+          <w:bCs w:val="0"/>
+          <w:i w:val="0"/>
+          <w:iCs w:val="0"/>
+          <w:caps w:val="0"/>
+          <w:smallCaps w:val="0"/>
+          <w:noProof w:val="0"/>
+          <w:color w:val="1F1F1F"/>
+          <w:sz w:val="24"/>
+          <w:szCs w:val="24"/>
+          <w:lang w:val="es-ES"/>
+        </w:rPr>
+        <w:t>.</w:t>
+      </w:r>
+    </w:p>
+    <w:p>
+      <w:pPr>
+        <w:pStyle w:val="Normal"/>
+        <w:spacing w:before="0" w:beforeAutospacing="off" w:after="0" w:afterAutospacing="off"/>
+        <w:ind w:left="0"/>
+        <w:rPr>
+          <w:rFonts w:ascii="Calibri" w:hAnsi="Calibri" w:eastAsia="Calibri" w:cs="Calibri"/>
+          <w:b w:val="0"/>
+          <w:bCs w:val="0"/>
+          <w:i w:val="0"/>
+          <w:iCs w:val="0"/>
+          <w:caps w:val="0"/>
+          <w:smallCaps w:val="0"/>
+          <w:noProof w:val="0"/>
+          <w:color w:val="1F1F1F"/>
+          <w:sz w:val="24"/>
+          <w:szCs w:val="24"/>
+          <w:lang w:val="es-ES"/>
+        </w:rPr>
+      </w:pPr>
+    </w:p>
+    <w:p>
+      <w:pPr>
+        <w:pStyle w:val="Normal"/>
+        <w:spacing w:before="0" w:beforeAutospacing="off" w:after="0" w:afterAutospacing="off"/>
+        <w:ind w:left="0"/>
+        <w:rPr>
+          <w:rFonts w:ascii="Calibri" w:hAnsi="Calibri" w:eastAsia="Calibri" w:cs="Calibri"/>
+          <w:b w:val="0"/>
+          <w:bCs w:val="0"/>
+          <w:i w:val="0"/>
+          <w:iCs w:val="0"/>
+          <w:caps w:val="0"/>
+          <w:smallCaps w:val="0"/>
+          <w:noProof w:val="0"/>
+          <w:color w:val="1F1F1F"/>
+          <w:sz w:val="24"/>
+          <w:szCs w:val="24"/>
+          <w:lang w:val="es-ES"/>
+        </w:rPr>
+      </w:pPr>
+      <w:r>
+        <w:rPr>
+          <w:rFonts w:ascii="Calibri" w:hAnsi="Calibri" w:eastAsia="Calibri" w:cs="Calibri"/>
+          <w:b w:val="0"/>
+          <w:bCs w:val="0"/>
+          <w:i w:val="0"/>
+          <w:iCs w:val="0"/>
+          <w:caps w:val="0"/>
+          <w:smallCaps w:val="0"/>
+          <w:noProof w:val="0"/>
+          <w:color w:val="1F1F1F"/>
+          <w:sz w:val="24"/>
+          <w:szCs w:val="24"/>
+          <w:lang w:val="es-ES"/>
+        </w:rPr>
+        <w:t>Wing</w:t>
+      </w:r>
+      <w:r>
+        <w:rPr>
+          <w:rFonts w:ascii="Calibri" w:hAnsi="Calibri" w:eastAsia="Calibri" w:cs="Calibri"/>
+          <w:b w:val="0"/>
+          <w:bCs w:val="0"/>
+          <w:i w:val="0"/>
+          <w:iCs w:val="0"/>
+          <w:caps w:val="0"/>
+          <w:smallCaps w:val="0"/>
+          <w:noProof w:val="0"/>
+          <w:color w:val="1F1F1F"/>
+          <w:sz w:val="24"/>
+          <w:szCs w:val="24"/>
+          <w:lang w:val="es-ES"/>
+        </w:rPr>
+        <w:t xml:space="preserve">, J. M. (2006). </w:t>
+      </w:r>
+      <w:r>
+        <w:rPr>
+          <w:rFonts w:ascii="Calibri" w:hAnsi="Calibri" w:eastAsia="Calibri" w:cs="Calibri"/>
+          <w:b w:val="0"/>
+          <w:bCs w:val="0"/>
+          <w:i w:val="0"/>
+          <w:iCs w:val="0"/>
+          <w:caps w:val="0"/>
+          <w:smallCaps w:val="0"/>
+          <w:noProof w:val="0"/>
+          <w:color w:val="1F1F1F"/>
+          <w:sz w:val="24"/>
+          <w:szCs w:val="24"/>
+          <w:lang w:val="es-ES"/>
+        </w:rPr>
+        <w:t>Computational</w:t>
+      </w:r>
+      <w:r>
+        <w:rPr>
+          <w:rFonts w:ascii="Calibri" w:hAnsi="Calibri" w:eastAsia="Calibri" w:cs="Calibri"/>
+          <w:b w:val="0"/>
+          <w:bCs w:val="0"/>
+          <w:i w:val="0"/>
+          <w:iCs w:val="0"/>
+          <w:caps w:val="0"/>
+          <w:smallCaps w:val="0"/>
+          <w:noProof w:val="0"/>
+          <w:color w:val="1F1F1F"/>
+          <w:sz w:val="24"/>
+          <w:szCs w:val="24"/>
+          <w:lang w:val="es-ES"/>
+        </w:rPr>
+        <w:t xml:space="preserve"> </w:t>
+      </w:r>
+      <w:r>
+        <w:rPr>
+          <w:rFonts w:ascii="Calibri" w:hAnsi="Calibri" w:eastAsia="Calibri" w:cs="Calibri"/>
+          <w:b w:val="0"/>
+          <w:bCs w:val="0"/>
+          <w:i w:val="0"/>
+          <w:iCs w:val="0"/>
+          <w:caps w:val="0"/>
+          <w:smallCaps w:val="0"/>
+          <w:noProof w:val="0"/>
+          <w:color w:val="1F1F1F"/>
+          <w:sz w:val="24"/>
+          <w:szCs w:val="24"/>
+          <w:lang w:val="es-ES"/>
+        </w:rPr>
+        <w:t>thinking</w:t>
+      </w:r>
+      <w:r>
+        <w:rPr>
+          <w:rFonts w:ascii="Calibri" w:hAnsi="Calibri" w:eastAsia="Calibri" w:cs="Calibri"/>
+          <w:b w:val="0"/>
+          <w:bCs w:val="0"/>
+          <w:i w:val="0"/>
+          <w:iCs w:val="0"/>
+          <w:caps w:val="0"/>
+          <w:smallCaps w:val="0"/>
+          <w:noProof w:val="0"/>
+          <w:color w:val="1F1F1F"/>
+          <w:sz w:val="24"/>
+          <w:szCs w:val="24"/>
+          <w:lang w:val="es-ES"/>
+        </w:rPr>
+        <w:t xml:space="preserve">. </w:t>
+      </w:r>
+      <w:r>
+        <w:rPr>
+          <w:rFonts w:ascii="Calibri" w:hAnsi="Calibri" w:eastAsia="Calibri" w:cs="Calibri"/>
+          <w:b w:val="0"/>
+          <w:bCs w:val="0"/>
+          <w:i w:val="0"/>
+          <w:iCs w:val="0"/>
+          <w:caps w:val="0"/>
+          <w:smallCaps w:val="0"/>
+          <w:noProof w:val="0"/>
+          <w:color w:val="1F1F1F"/>
+          <w:sz w:val="24"/>
+          <w:szCs w:val="24"/>
+          <w:lang w:val="es-ES"/>
+        </w:rPr>
+        <w:t>Communications</w:t>
+      </w:r>
+      <w:r>
+        <w:rPr>
+          <w:rFonts w:ascii="Calibri" w:hAnsi="Calibri" w:eastAsia="Calibri" w:cs="Calibri"/>
+          <w:b w:val="0"/>
+          <w:bCs w:val="0"/>
+          <w:i w:val="0"/>
+          <w:iCs w:val="0"/>
+          <w:caps w:val="0"/>
+          <w:smallCaps w:val="0"/>
+          <w:noProof w:val="0"/>
+          <w:color w:val="1F1F1F"/>
+          <w:sz w:val="24"/>
+          <w:szCs w:val="24"/>
+          <w:lang w:val="es-ES"/>
+        </w:rPr>
+        <w:t xml:space="preserve"> </w:t>
+      </w:r>
+      <w:r>
+        <w:rPr>
+          <w:rFonts w:ascii="Calibri" w:hAnsi="Calibri" w:eastAsia="Calibri" w:cs="Calibri"/>
+          <w:b w:val="0"/>
+          <w:bCs w:val="0"/>
+          <w:i w:val="0"/>
+          <w:iCs w:val="0"/>
+          <w:caps w:val="0"/>
+          <w:smallCaps w:val="0"/>
+          <w:noProof w:val="0"/>
+          <w:color w:val="1F1F1F"/>
+          <w:sz w:val="24"/>
+          <w:szCs w:val="24"/>
+          <w:lang w:val="es-ES"/>
+        </w:rPr>
+        <w:t>of</w:t>
+      </w:r>
+      <w:r>
+        <w:rPr>
+          <w:rFonts w:ascii="Calibri" w:hAnsi="Calibri" w:eastAsia="Calibri" w:cs="Calibri"/>
+          <w:b w:val="0"/>
+          <w:bCs w:val="0"/>
+          <w:i w:val="0"/>
+          <w:iCs w:val="0"/>
+          <w:caps w:val="0"/>
+          <w:smallCaps w:val="0"/>
+          <w:noProof w:val="0"/>
+          <w:color w:val="1F1F1F"/>
+          <w:sz w:val="24"/>
+          <w:szCs w:val="24"/>
+          <w:lang w:val="es-ES"/>
+        </w:rPr>
+        <w:t xml:space="preserve"> </w:t>
+      </w:r>
+      <w:r>
+        <w:rPr>
+          <w:rFonts w:ascii="Calibri" w:hAnsi="Calibri" w:eastAsia="Calibri" w:cs="Calibri"/>
+          <w:b w:val="0"/>
+          <w:bCs w:val="0"/>
+          <w:i w:val="0"/>
+          <w:iCs w:val="0"/>
+          <w:caps w:val="0"/>
+          <w:smallCaps w:val="0"/>
+          <w:noProof w:val="0"/>
+          <w:color w:val="1F1F1F"/>
+          <w:sz w:val="24"/>
+          <w:szCs w:val="24"/>
+          <w:lang w:val="es-ES"/>
+        </w:rPr>
+        <w:t>the</w:t>
+      </w:r>
+      <w:r>
+        <w:rPr>
+          <w:rFonts w:ascii="Calibri" w:hAnsi="Calibri" w:eastAsia="Calibri" w:cs="Calibri"/>
+          <w:b w:val="0"/>
+          <w:bCs w:val="0"/>
+          <w:i w:val="0"/>
+          <w:iCs w:val="0"/>
+          <w:caps w:val="0"/>
+          <w:smallCaps w:val="0"/>
+          <w:noProof w:val="0"/>
+          <w:color w:val="1F1F1F"/>
+          <w:sz w:val="24"/>
+          <w:szCs w:val="24"/>
+          <w:lang w:val="es-ES"/>
+        </w:rPr>
+        <w:t xml:space="preserve"> ACM, 49(3), 33-35.</w:t>
       </w:r>
     </w:p>
     <w:p>
@@ -746,6 +3538,49 @@
     </w:sectPr>
   </w:body>
 </w:document>
+</file>
+
+<file path=word/footnotes.xml><?xml version="1.0" encoding="utf-8"?>
+<w:footnotes xmlns:w14="http://schemas.microsoft.com/office/word/2010/wordml" xmlns:w="http://schemas.openxmlformats.org/wordprocessingml/2006/main">
+  <w:footnote w:type="separator" w:id="-1">
+    <w:p>
+      <w:pPr>
+        <w:spacing w:after="0" w:line="240" w:lineRule="auto"/>
+      </w:pPr>
+      <w:r>
+        <w:separator/>
+      </w:r>
+    </w:p>
+  </w:footnote>
+  <w:footnote w:type="continuationSeparator" w:id="0">
+    <w:p>
+      <w:pPr>
+        <w:spacing w:after="0" w:line="240" w:lineRule="auto"/>
+      </w:pPr>
+      <w:r>
+        <w:continuationSeparator/>
+      </w:r>
+    </w:p>
+  </w:footnote>
+  <w:footnote w:id="18022">
+    <w:p>
+      <w:pPr>
+        <w:pStyle w:val="FootnoteText"/>
+        <w:bidi w:val="0"/>
+      </w:pPr>
+      <w:r>
+        <w:rPr>
+          <w:rStyle w:val="FootnoteReference"/>
+        </w:rPr>
+        <w:footnoteRef/>
+      </w:r>
+      <w:r>
+        <w:rPr/>
+        <w:t xml:space="preserve"> </w:t>
+      </w:r>
+    </w:p>
+  </w:footnote>
+</w:footnotes>
 </file>
 
 <file path=word/numbering.xml><?xml version="1.0" encoding="utf-8"?>
@@ -1617,6 +4452,52 @@
       <w:contextualSpacing xmlns:w="http://schemas.openxmlformats.org/wordprocessingml/2006/main"/>
     </w:pPr>
   </w:style>
+  <w:style xmlns:w14="http://schemas.microsoft.com/office/word/2010/wordml" xmlns:mc="http://schemas.openxmlformats.org/markup-compatibility/2006" xmlns:w="http://schemas.openxmlformats.org/wordprocessingml/2006/main" w:type="character" w:styleId="FootnoteReference" mc:Ignorable="w14">
+    <w:basedOn xmlns:w="http://schemas.openxmlformats.org/wordprocessingml/2006/main" w:val="DefaultParagraphFont"/>
+    <w:name xmlns:w="http://schemas.openxmlformats.org/wordprocessingml/2006/main" w:val="footnote reference"/>
+    <w:rPr xmlns:w="http://schemas.openxmlformats.org/wordprocessingml/2006/main">
+      <w:vertAlign w:val="superscript"/>
+    </w:rPr>
+    <w:semiHidden xmlns:w="http://schemas.openxmlformats.org/wordprocessingml/2006/main"/>
+    <w:uiPriority xmlns:w="http://schemas.openxmlformats.org/wordprocessingml/2006/main" w:val="99"/>
+    <w:unhideWhenUsed xmlns:w="http://schemas.openxmlformats.org/wordprocessingml/2006/main"/>
+  </w:style>
+  <w:style xmlns:w14="http://schemas.microsoft.com/office/word/2010/wordml" xmlns:mc="http://schemas.openxmlformats.org/markup-compatibility/2006" xmlns:w="http://schemas.openxmlformats.org/wordprocessingml/2006/main" w:type="character" w:styleId="FootnoteTextChar" w:customStyle="1" mc:Ignorable="w14">
+    <w:name xmlns:w="http://schemas.openxmlformats.org/wordprocessingml/2006/main" w:val="Footnote Text Char"/>
+    <w:basedOn xmlns:w="http://schemas.openxmlformats.org/wordprocessingml/2006/main" w:val="DefaultParagraphFont"/>
+    <w:link xmlns:w="http://schemas.openxmlformats.org/wordprocessingml/2006/main" w:val="FootnoteText"/>
+    <w:rPr xmlns:w="http://schemas.openxmlformats.org/wordprocessingml/2006/main">
+      <w:sz w:val="20"/>
+      <w:szCs w:val="20"/>
+    </w:rPr>
+    <w:semiHidden xmlns:w="http://schemas.openxmlformats.org/wordprocessingml/2006/main"/>
+    <w:uiPriority xmlns:w="http://schemas.openxmlformats.org/wordprocessingml/2006/main" w:val="99"/>
+  </w:style>
+  <w:style xmlns:w14="http://schemas.microsoft.com/office/word/2010/wordml" xmlns:mc="http://schemas.openxmlformats.org/markup-compatibility/2006" xmlns:w="http://schemas.openxmlformats.org/wordprocessingml/2006/main" w:type="paragraph" w:styleId="FootnoteText" mc:Ignorable="w14">
+    <w:basedOn xmlns:w="http://schemas.openxmlformats.org/wordprocessingml/2006/main" w:val="Normal"/>
+    <w:link xmlns:w="http://schemas.openxmlformats.org/wordprocessingml/2006/main" w:val="FootnoteTextChar"/>
+    <w:name xmlns:w="http://schemas.openxmlformats.org/wordprocessingml/2006/main" w:val="footnote text"/>
+    <w:pPr xmlns:w="http://schemas.openxmlformats.org/wordprocessingml/2006/main">
+      <w:spacing xmlns:w="http://schemas.openxmlformats.org/wordprocessingml/2006/main" w:after="0" w:line="240" w:lineRule="auto"/>
+    </w:pPr>
+    <w:rPr xmlns:w="http://schemas.openxmlformats.org/wordprocessingml/2006/main">
+      <w:sz w:val="20"/>
+      <w:szCs w:val="20"/>
+    </w:rPr>
+    <w:semiHidden xmlns:w="http://schemas.openxmlformats.org/wordprocessingml/2006/main"/>
+    <w:uiPriority xmlns:w="http://schemas.openxmlformats.org/wordprocessingml/2006/main" w:val="99"/>
+    <w:unhideWhenUsed xmlns:w="http://schemas.openxmlformats.org/wordprocessingml/2006/main"/>
+  </w:style>
+  <w:style xmlns:w14="http://schemas.microsoft.com/office/word/2010/wordml" xmlns:mc="http://schemas.openxmlformats.org/markup-compatibility/2006" xmlns:w="http://schemas.openxmlformats.org/wordprocessingml/2006/main" w:type="character" w:styleId="Hyperlink" mc:Ignorable="w14">
+    <w:name xmlns:w="http://schemas.openxmlformats.org/wordprocessingml/2006/main" w:val="Hyperlink"/>
+    <w:basedOn xmlns:w="http://schemas.openxmlformats.org/wordprocessingml/2006/main" w:val="DefaultParagraphFont"/>
+    <w:uiPriority xmlns:w="http://schemas.openxmlformats.org/wordprocessingml/2006/main" w:val="99"/>
+    <w:unhideWhenUsed xmlns:w="http://schemas.openxmlformats.org/wordprocessingml/2006/main"/>
+    <w:rPr xmlns:w="http://schemas.openxmlformats.org/wordprocessingml/2006/main">
+      <w:color w:val="0563C1" w:themeColor="hyperlink"/>
+      <w:u w:val="single"/>
+    </w:rPr>
+  </w:style>
 </w:styles>
 </file>
 

</xml_diff>